<commit_message>
chore: update release change plan template
</commit_message>
<xml_diff>
--- a/server/templates/release-documents/投产变更方案模版.docx
+++ b/server/templates/release-documents/投产变更方案模版.docx
@@ -6,7 +6,7 @@
       <w:pPr>
         <w:jc w:val="center"/>
         <w:rPr>
-          <w:rFonts w:ascii="微软雅黑" w:eastAsia="微软雅黑" w:hAnsi="微软雅黑" w:cs="微软雅黑"/>
+          <w:rFonts w:ascii="微软雅黑" w:eastAsia="微软雅黑" w:hAnsi="微软雅黑" w:cs="微软雅黑" w:hint="eastAsia"/>
           <w:b/>
           <w:bCs/>
           <w:spacing w:val="2"/>
@@ -43,7 +43,7 @@
       <w:pPr>
         <w:spacing w:after="0" w:line="240" w:lineRule="auto"/>
         <w:rPr>
-          <w:rFonts w:ascii="微软雅黑" w:eastAsia="微软雅黑" w:hAnsi="微软雅黑"/>
+          <w:rFonts w:ascii="微软雅黑" w:eastAsia="微软雅黑" w:hAnsi="微软雅黑" w:hint="eastAsia"/>
           <w:b/>
           <w:bCs/>
           <w:szCs w:val="22"/>
@@ -53,13 +53,15 @@
     <w:sdt>
       <w:sdtPr>
         <w:rPr>
-          <w:rFonts w:ascii="微软雅黑" w:eastAsia="微软雅黑" w:hAnsi="微软雅黑"/>
+          <w:rFonts w:ascii="微软雅黑" w:eastAsia="微软雅黑" w:hAnsi="微软雅黑" w:cstheme="minorBidi"/>
           <w:b/>
           <w:bCs/>
           <w:color w:val="auto"/>
+          <w:kern w:val="2"/>
           <w:sz w:val="22"/>
           <w:szCs w:val="22"/>
           <w:lang w:val="zh-CN"/>
+          <w14:ligatures w14:val="standardContextual"/>
         </w:rPr>
         <w:id w:val="-883559567"/>
         <w:docPartObj>
@@ -67,13 +69,6 @@
           <w:docPartUnique/>
         </w:docPartObj>
       </w:sdtPr>
-      <w:sdtEndPr>
-        <w:rPr>
-          <w:rFonts w:cstheme="minorBidi"/>
-          <w:kern w:val="2"/>
-          <w14:ligatures w14:val="standardContextual"/>
-        </w:rPr>
-      </w:sdtEndPr>
       <w:sdtContent>
         <w:p>
           <w:pPr>
@@ -131,7 +126,7 @@
           </w:r>
           <w:r>
             <w:rPr>
-              <w:rFonts w:ascii="微软雅黑" w:eastAsia="微软雅黑" w:hAnsi="微软雅黑" w:hint="eastAsia"/>
+              <w:rFonts w:ascii="微软雅黑" w:eastAsia="微软雅黑" w:hAnsi="微软雅黑"/>
               <w:szCs w:val="22"/>
             </w:rPr>
             <w:fldChar w:fldCharType="separate"/>
@@ -1323,7 +1318,7 @@
     <w:p>
       <w:pPr>
         <w:rPr>
-          <w:rFonts w:ascii="微软雅黑" w:eastAsia="微软雅黑" w:hAnsi="微软雅黑"/>
+          <w:rFonts w:ascii="微软雅黑" w:eastAsia="微软雅黑" w:hAnsi="微软雅黑" w:hint="eastAsia"/>
         </w:rPr>
       </w:pPr>
     </w:p>
@@ -1344,6 +1339,9 @@
     <w:p>
       <w:pPr>
         <w:pStyle w:val="2"/>
+        <w:rPr>
+          <w:rFonts w:hint="eastAsia"/>
+        </w:rPr>
       </w:pPr>
       <w:bookmarkStart w:id="1" w:name="_Toc235027605"/>
       <w:r>
@@ -1498,16 +1496,6 @@
                 <w:lang w:eastAsia="zh-CN"/>
               </w:rPr>
             </w:pPr>
-            <w:r>
-              <w:rPr>
-                <w:color w:val="auto"/>
-                <w:spacing w:val="9"/>
-                <w:sz w:val="18"/>
-                <w:szCs w:val="18"/>
-                <w:lang w:eastAsia="zh-CN"/>
-              </w:rPr>
-              <w:t>填写变更需求提出部门</w:t>
-            </w:r>
           </w:p>
         </w:tc>
       </w:tr>
@@ -1562,17 +1550,6 @@
                 <w:szCs w:val="18"/>
               </w:rPr>
             </w:pPr>
-            <w:proofErr w:type="spellStart"/>
-            <w:r>
-              <w:rPr>
-                <w:color w:val="auto"/>
-                <w:spacing w:val="9"/>
-                <w:sz w:val="18"/>
-                <w:szCs w:val="18"/>
-              </w:rPr>
-              <w:t>填写变更实施部门</w:t>
-            </w:r>
-            <w:proofErr w:type="spellEnd"/>
           </w:p>
         </w:tc>
       </w:tr>
@@ -1622,8 +1599,6 @@
               <w:spacing w:after="0"/>
               <w:rPr>
                 <w:rFonts w:hint="eastAsia"/>
-                <w:i/>
-                <w:iCs/>
                 <w:color w:val="4C94D8" w:themeColor="text2" w:themeTint="80"/>
                 <w:sz w:val="18"/>
                 <w:szCs w:val="18"/>
@@ -1632,8 +1607,6 @@
             </w:pPr>
             <w:r>
               <w:rPr>
-                <w:i/>
-                <w:iCs/>
                 <w:color w:val="4C94D8" w:themeColor="text2" w:themeTint="80"/>
                 <w:spacing w:val="9"/>
                 <w:sz w:val="18"/>
@@ -1645,8 +1618,6 @@
             <w:r>
               <w:rPr>
                 <w:rFonts w:cs="Arial"/>
-                <w:i/>
-                <w:iCs/>
                 <w:color w:val="4C94D8" w:themeColor="text2" w:themeTint="80"/>
                 <w:spacing w:val="9"/>
                 <w:sz w:val="18"/>
@@ -1657,8 +1628,6 @@
             </w:r>
             <w:r>
               <w:rPr>
-                <w:i/>
-                <w:iCs/>
                 <w:color w:val="4C94D8" w:themeColor="text2" w:themeTint="80"/>
                 <w:spacing w:val="9"/>
                 <w:sz w:val="18"/>
@@ -1670,8 +1639,6 @@
             <w:r>
               <w:rPr>
                 <w:rFonts w:cs="Arial"/>
-                <w:i/>
-                <w:iCs/>
                 <w:color w:val="4C94D8" w:themeColor="text2" w:themeTint="80"/>
                 <w:spacing w:val="9"/>
                 <w:sz w:val="18"/>
@@ -1682,8 +1649,6 @@
             </w:r>
             <w:r>
               <w:rPr>
-                <w:i/>
-                <w:iCs/>
                 <w:color w:val="4C94D8" w:themeColor="text2" w:themeTint="80"/>
                 <w:spacing w:val="9"/>
                 <w:sz w:val="18"/>
@@ -1695,8 +1660,6 @@
             <w:r>
               <w:rPr>
                 <w:rFonts w:cs="Arial"/>
-                <w:i/>
-                <w:iCs/>
                 <w:color w:val="4C94D8" w:themeColor="text2" w:themeTint="80"/>
                 <w:spacing w:val="9"/>
                 <w:sz w:val="18"/>
@@ -1707,8 +1670,6 @@
             </w:r>
             <w:r>
               <w:rPr>
-                <w:i/>
-                <w:iCs/>
                 <w:color w:val="4C94D8" w:themeColor="text2" w:themeTint="80"/>
                 <w:spacing w:val="9"/>
                 <w:sz w:val="18"/>
@@ -1720,8 +1681,6 @@
             <w:r>
               <w:rPr>
                 <w:rFonts w:cs="Arial"/>
-                <w:i/>
-                <w:iCs/>
                 <w:color w:val="4C94D8" w:themeColor="text2" w:themeTint="80"/>
                 <w:spacing w:val="9"/>
                 <w:sz w:val="18"/>
@@ -1732,8 +1691,6 @@
             </w:r>
             <w:r>
               <w:rPr>
-                <w:i/>
-                <w:iCs/>
                 <w:color w:val="4C94D8" w:themeColor="text2" w:themeTint="80"/>
                 <w:spacing w:val="9"/>
                 <w:sz w:val="18"/>
@@ -1796,17 +1753,6 @@
                 <w:szCs w:val="18"/>
               </w:rPr>
             </w:pPr>
-            <w:proofErr w:type="spellStart"/>
-            <w:r>
-              <w:rPr>
-                <w:color w:val="auto"/>
-                <w:spacing w:val="9"/>
-                <w:sz w:val="18"/>
-                <w:szCs w:val="18"/>
-              </w:rPr>
-              <w:t>填写变更单号</w:t>
-            </w:r>
-            <w:proofErr w:type="spellEnd"/>
           </w:p>
         </w:tc>
       </w:tr>
@@ -1862,16 +1808,6 @@
                 <w:lang w:eastAsia="zh-CN"/>
               </w:rPr>
             </w:pPr>
-            <w:r>
-              <w:rPr>
-                <w:color w:val="auto"/>
-                <w:spacing w:val="9"/>
-                <w:sz w:val="18"/>
-                <w:szCs w:val="18"/>
-                <w:lang w:eastAsia="zh-CN"/>
-              </w:rPr>
-              <w:t>填写变更的初衷与目标</w:t>
-            </w:r>
           </w:p>
         </w:tc>
       </w:tr>
@@ -1928,16 +1864,6 @@
                 <w:lang w:eastAsia="zh-CN"/>
               </w:rPr>
             </w:pPr>
-            <w:r>
-              <w:rPr>
-                <w:color w:val="auto"/>
-                <w:spacing w:val="9"/>
-                <w:sz w:val="18"/>
-                <w:szCs w:val="18"/>
-                <w:lang w:eastAsia="zh-CN"/>
-              </w:rPr>
-              <w:t>详细描述业务或技术需求</w:t>
-            </w:r>
           </w:p>
         </w:tc>
       </w:tr>
@@ -1993,16 +1919,6 @@
                 <w:lang w:eastAsia="zh-CN"/>
               </w:rPr>
             </w:pPr>
-            <w:r>
-              <w:rPr>
-                <w:color w:val="auto"/>
-                <w:spacing w:val="9"/>
-                <w:sz w:val="18"/>
-                <w:szCs w:val="18"/>
-                <w:lang w:eastAsia="zh-CN"/>
-              </w:rPr>
-              <w:t>填写变更对象范围和变更内容</w:t>
-            </w:r>
           </w:p>
         </w:tc>
       </w:tr>
@@ -2053,14 +1969,14 @@
               <w:spacing w:after="0"/>
               <w:rPr>
                 <w:rFonts w:hint="eastAsia"/>
-                <w:color w:val="auto"/>
-                <w:sz w:val="18"/>
-                <w:szCs w:val="18"/>
-              </w:rPr>
-            </w:pPr>
-            <w:r>
-              <w:rPr>
-                <w:color w:val="auto"/>
+                <w:color w:val="4C94D8" w:themeColor="text2" w:themeTint="80"/>
+                <w:sz w:val="18"/>
+                <w:szCs w:val="18"/>
+              </w:rPr>
+            </w:pPr>
+            <w:r>
+              <w:rPr>
+                <w:color w:val="4C94D8" w:themeColor="text2" w:themeTint="80"/>
                 <w:spacing w:val="10"/>
                 <w:sz w:val="18"/>
                 <w:szCs w:val="18"/>
@@ -2070,7 +1986,7 @@
             <w:r>
               <w:rPr>
                 <w:rFonts w:cs="Arial"/>
-                <w:color w:val="auto"/>
+                <w:color w:val="4C94D8" w:themeColor="text2" w:themeTint="80"/>
                 <w:spacing w:val="10"/>
                 <w:sz w:val="18"/>
                 <w:szCs w:val="18"/>
@@ -2079,7 +1995,7 @@
             </w:r>
             <w:r>
               <w:rPr>
-                <w:color w:val="auto"/>
+                <w:color w:val="4C94D8" w:themeColor="text2" w:themeTint="80"/>
                 <w:spacing w:val="10"/>
                 <w:sz w:val="18"/>
                 <w:szCs w:val="18"/>
@@ -2089,7 +2005,7 @@
             <w:r>
               <w:rPr>
                 <w:rFonts w:cs="Arial"/>
-                <w:color w:val="auto"/>
+                <w:color w:val="4C94D8" w:themeColor="text2" w:themeTint="80"/>
                 <w:spacing w:val="10"/>
                 <w:sz w:val="18"/>
                 <w:szCs w:val="18"/>
@@ -2098,7 +2014,7 @@
             </w:r>
             <w:r>
               <w:rPr>
-                <w:color w:val="auto"/>
+                <w:color w:val="4C94D8" w:themeColor="text2" w:themeTint="80"/>
                 <w:spacing w:val="10"/>
                 <w:sz w:val="18"/>
                 <w:szCs w:val="18"/>
@@ -2108,7 +2024,7 @@
             <w:proofErr w:type="gramStart"/>
             <w:r>
               <w:rPr>
-                <w:color w:val="auto"/>
+                <w:color w:val="4C94D8" w:themeColor="text2" w:themeTint="80"/>
                 <w:spacing w:val="10"/>
                 <w:sz w:val="18"/>
                 <w:szCs w:val="18"/>
@@ -2118,7 +2034,7 @@
             <w:r>
               <w:rPr>
                 <w:rFonts w:cs="Arial"/>
-                <w:color w:val="auto"/>
+                <w:color w:val="4C94D8" w:themeColor="text2" w:themeTint="80"/>
                 <w:spacing w:val="10"/>
                 <w:sz w:val="18"/>
                 <w:szCs w:val="18"/>
@@ -2127,7 +2043,7 @@
             </w:r>
             <w:r>
               <w:rPr>
-                <w:color w:val="auto"/>
+                <w:color w:val="4C94D8" w:themeColor="text2" w:themeTint="80"/>
                 <w:spacing w:val="10"/>
                 <w:sz w:val="18"/>
                 <w:szCs w:val="18"/>
@@ -2186,14 +2102,14 @@
               <w:spacing w:after="0"/>
               <w:rPr>
                 <w:rFonts w:hint="eastAsia"/>
-                <w:color w:val="auto"/>
-                <w:sz w:val="18"/>
-                <w:szCs w:val="18"/>
-              </w:rPr>
-            </w:pPr>
-            <w:r>
-              <w:rPr>
-                <w:color w:val="auto"/>
+                <w:color w:val="4C94D8" w:themeColor="text2" w:themeTint="80"/>
+                <w:sz w:val="18"/>
+                <w:szCs w:val="18"/>
+              </w:rPr>
+            </w:pPr>
+            <w:r>
+              <w:rPr>
+                <w:color w:val="4C94D8" w:themeColor="text2" w:themeTint="80"/>
                 <w:spacing w:val="10"/>
                 <w:position w:val="-1"/>
                 <w:sz w:val="18"/>
@@ -2204,7 +2120,7 @@
             <w:r>
               <w:rPr>
                 <w:rFonts w:cs="Arial"/>
-                <w:color w:val="auto"/>
+                <w:color w:val="4C94D8" w:themeColor="text2" w:themeTint="80"/>
                 <w:spacing w:val="10"/>
                 <w:position w:val="-1"/>
                 <w:sz w:val="18"/>
@@ -2214,7 +2130,7 @@
             </w:r>
             <w:r>
               <w:rPr>
-                <w:color w:val="auto"/>
+                <w:color w:val="4C94D8" w:themeColor="text2" w:themeTint="80"/>
                 <w:spacing w:val="10"/>
                 <w:position w:val="-1"/>
                 <w:sz w:val="18"/>
@@ -2225,7 +2141,7 @@
             <w:r>
               <w:rPr>
                 <w:rFonts w:cs="Arial"/>
-                <w:color w:val="auto"/>
+                <w:color w:val="4C94D8" w:themeColor="text2" w:themeTint="80"/>
                 <w:spacing w:val="10"/>
                 <w:position w:val="-1"/>
                 <w:sz w:val="18"/>
@@ -2235,7 +2151,7 @@
             </w:r>
             <w:r>
               <w:rPr>
-                <w:color w:val="auto"/>
+                <w:color w:val="4C94D8" w:themeColor="text2" w:themeTint="80"/>
                 <w:spacing w:val="10"/>
                 <w:position w:val="-1"/>
                 <w:sz w:val="18"/>
@@ -2246,7 +2162,7 @@
             <w:proofErr w:type="gramStart"/>
             <w:r>
               <w:rPr>
-                <w:color w:val="auto"/>
+                <w:color w:val="4C94D8" w:themeColor="text2" w:themeTint="80"/>
                 <w:spacing w:val="10"/>
                 <w:position w:val="-1"/>
                 <w:sz w:val="18"/>
@@ -2257,7 +2173,7 @@
             <w:r>
               <w:rPr>
                 <w:rFonts w:cs="Arial"/>
-                <w:color w:val="auto"/>
+                <w:color w:val="4C94D8" w:themeColor="text2" w:themeTint="80"/>
                 <w:spacing w:val="10"/>
                 <w:position w:val="-1"/>
                 <w:sz w:val="18"/>
@@ -2267,7 +2183,7 @@
             </w:r>
             <w:r>
               <w:rPr>
-                <w:color w:val="auto"/>
+                <w:color w:val="4C94D8" w:themeColor="text2" w:themeTint="80"/>
                 <w:spacing w:val="10"/>
                 <w:position w:val="-1"/>
                 <w:sz w:val="18"/>
@@ -2282,14 +2198,20 @@
     </w:tbl>
     <w:p>
       <w:pPr>
-        <w:rPr>
-          <w:rFonts w:ascii="微软雅黑" w:eastAsia="微软雅黑" w:hAnsi="微软雅黑"/>
+        <w:spacing w:after="0" w:line="240" w:lineRule="auto"/>
+        <w:rPr>
+          <w:rFonts w:ascii="微软雅黑" w:eastAsia="微软雅黑" w:hAnsi="微软雅黑" w:hint="eastAsia"/>
+          <w:sz w:val="18"/>
+          <w:szCs w:val="18"/>
         </w:rPr>
       </w:pPr>
     </w:p>
     <w:p>
       <w:pPr>
         <w:pStyle w:val="2"/>
+        <w:rPr>
+          <w:rFonts w:hint="eastAsia"/>
+        </w:rPr>
       </w:pPr>
       <w:bookmarkStart w:id="2" w:name="_Toc235027606"/>
       <w:r>
@@ -2453,28 +2375,6 @@
                 <w:lang w:eastAsia="zh-CN"/>
               </w:rPr>
             </w:pPr>
-            <w:r>
-              <w:rPr>
-                <w:rFonts w:hint="eastAsia"/>
-                <w:color w:val="auto"/>
-                <w:spacing w:val="9"/>
-                <w:sz w:val="18"/>
-                <w:szCs w:val="18"/>
-                <w:lang w:eastAsia="zh-CN"/>
-              </w:rPr>
-              <w:t>填写物理子系统</w:t>
-            </w:r>
-            <w:r>
-              <w:rPr>
-                <w:rFonts w:hint="eastAsia"/>
-                <w:color w:val="auto"/>
-                <w:spacing w:val="9"/>
-                <w:sz w:val="18"/>
-                <w:szCs w:val="18"/>
-                <w:lang w:eastAsia="zh-CN"/>
-              </w:rPr>
-              <w:t>编号</w:t>
-            </w:r>
           </w:p>
         </w:tc>
       </w:tr>
@@ -2539,28 +2439,6 @@
                 <w:szCs w:val="18"/>
               </w:rPr>
             </w:pPr>
-            <w:r>
-              <w:rPr>
-                <w:rFonts w:hint="eastAsia"/>
-                <w:color w:val="auto"/>
-                <w:spacing w:val="9"/>
-                <w:sz w:val="18"/>
-                <w:szCs w:val="18"/>
-                <w:lang w:eastAsia="zh-CN"/>
-              </w:rPr>
-              <w:t>填写物理子系统</w:t>
-            </w:r>
-            <w:r>
-              <w:rPr>
-                <w:rFonts w:hint="eastAsia"/>
-                <w:color w:val="auto"/>
-                <w:spacing w:val="9"/>
-                <w:sz w:val="18"/>
-                <w:szCs w:val="18"/>
-                <w:lang w:eastAsia="zh-CN"/>
-              </w:rPr>
-              <w:t>名称</w:t>
-            </w:r>
           </w:p>
         </w:tc>
       </w:tr>
@@ -2627,30 +2505,6 @@
                 <w:lang w:eastAsia="zh-CN"/>
               </w:rPr>
             </w:pPr>
-            <w:r>
-              <w:rPr>
-                <w:rFonts w:hint="eastAsia"/>
-                <w:color w:val="auto"/>
-                <w:spacing w:val="9"/>
-                <w:sz w:val="18"/>
-                <w:szCs w:val="18"/>
-                <w:lang w:eastAsia="zh-CN"/>
-              </w:rPr>
-              <w:t>填写系统运</w:t>
-            </w:r>
-            <w:proofErr w:type="gramStart"/>
-            <w:r>
-              <w:rPr>
-                <w:rFonts w:hint="eastAsia"/>
-                <w:color w:val="auto"/>
-                <w:spacing w:val="9"/>
-                <w:sz w:val="18"/>
-                <w:szCs w:val="18"/>
-                <w:lang w:eastAsia="zh-CN"/>
-              </w:rPr>
-              <w:t>维部门</w:t>
-            </w:r>
-            <w:proofErr w:type="gramEnd"/>
           </w:p>
         </w:tc>
       </w:tr>
@@ -2704,18 +2558,94 @@
                 <w:szCs w:val="18"/>
               </w:rPr>
             </w:pPr>
-            <w:proofErr w:type="spellStart"/>
-            <w:r>
+          </w:p>
+        </w:tc>
+      </w:tr>
+    </w:tbl>
+    <w:p>
+      <w:pPr>
+        <w:spacing w:after="0" w:line="240" w:lineRule="auto"/>
+        <w:rPr>
+          <w:rFonts w:ascii="微软雅黑" w:eastAsia="微软雅黑" w:hAnsi="微软雅黑"/>
+          <w:sz w:val="18"/>
+          <w:szCs w:val="18"/>
+        </w:rPr>
+      </w:pPr>
+    </w:p>
+    <w:tbl>
+      <w:tblPr>
+        <w:tblStyle w:val="ae"/>
+        <w:tblW w:w="8618" w:type="dxa"/>
+        <w:jc w:val="center"/>
+        <w:tblLayout w:type="fixed"/>
+        <w:tblLook w:val="04A0" w:firstRow="1" w:lastRow="0" w:firstColumn="1" w:lastColumn="0" w:noHBand="0" w:noVBand="1"/>
+      </w:tblPr>
+      <w:tblGrid>
+        <w:gridCol w:w="1958"/>
+        <w:gridCol w:w="6660"/>
+      </w:tblGrid>
+      <w:tr>
+        <w:trPr>
+          <w:trHeight w:val="20"/>
+          <w:jc w:val="center"/>
+        </w:trPr>
+        <w:tc>
+          <w:tcPr>
+            <w:tcW w:w="1958" w:type="dxa"/>
+            <w:vAlign w:val="center"/>
+          </w:tcPr>
+          <w:p>
+            <w:pPr>
+              <w:pStyle w:val="TableText"/>
+              <w:spacing w:after="0"/>
+              <w:jc w:val="center"/>
               <w:rPr>
                 <w:rFonts w:hint="eastAsia"/>
                 <w:color w:val="auto"/>
+                <w:sz w:val="18"/>
+                <w:szCs w:val="18"/>
+              </w:rPr>
+            </w:pPr>
+            <w:r>
+              <w:rPr>
+                <w:color w:val="auto"/>
+                <w:spacing w:val="5"/>
+                <w:sz w:val="18"/>
+                <w:szCs w:val="18"/>
+                <w:lang w:eastAsia="zh-CN"/>
+              </w:rPr>
+              <w:t>系统配置</w:t>
+            </w:r>
+          </w:p>
+        </w:tc>
+        <w:tc>
+          <w:tcPr>
+            <w:tcW w:w="6660" w:type="dxa"/>
+            <w:vAlign w:val="center"/>
+          </w:tcPr>
+          <w:p>
+            <w:pPr>
+              <w:pStyle w:val="TableText"/>
+              <w:spacing w:after="0"/>
+              <w:rPr>
+                <w:rFonts w:hint="eastAsia"/>
+                <w:color w:val="4C94D8" w:themeColor="text2" w:themeTint="80"/>
+                <w:sz w:val="18"/>
+                <w:szCs w:val="18"/>
+                <w:lang w:eastAsia="zh-CN"/>
+              </w:rPr>
+            </w:pPr>
+            <w:r>
+              <w:rPr>
+                <w:rFonts w:hint="eastAsia"/>
+                <w:color w:val="4C94D8" w:themeColor="text2" w:themeTint="80"/>
                 <w:spacing w:val="9"/>
                 <w:sz w:val="18"/>
                 <w:szCs w:val="18"/>
-              </w:rPr>
-              <w:t>填写系统业务功能</w:t>
-            </w:r>
-            <w:proofErr w:type="spellEnd"/>
+                <w:lang w:eastAsia="zh-CN"/>
+              </w:rPr>
+              <w:t>填写应用、操作系统、数据库、中间件、基础设施配置信息</w:t>
+            </w:r>
           </w:p>
         </w:tc>
       </w:tr>
@@ -2733,6 +2663,7 @@
             <w:pPr>
               <w:pStyle w:val="TableText"/>
               <w:spacing w:after="0"/>
+              <w:ind w:left="3"/>
               <w:jc w:val="center"/>
               <w:rPr>
                 <w:rFonts w:hint="eastAsia"/>
@@ -2749,7 +2680,7 @@
                 <w:szCs w:val="18"/>
                 <w:lang w:eastAsia="zh-CN"/>
               </w:rPr>
-              <w:t>系统配置</w:t>
+              <w:t>系统架构</w:t>
             </w:r>
           </w:p>
         </w:tc>
@@ -2764,7 +2695,7 @@
               <w:spacing w:after="0"/>
               <w:rPr>
                 <w:rFonts w:hint="eastAsia"/>
-                <w:color w:val="auto"/>
+                <w:color w:val="4C94D8" w:themeColor="text2" w:themeTint="80"/>
                 <w:sz w:val="18"/>
                 <w:szCs w:val="18"/>
                 <w:lang w:eastAsia="zh-CN"/>
@@ -2773,13 +2704,13 @@
             <w:r>
               <w:rPr>
                 <w:rFonts w:hint="eastAsia"/>
-                <w:color w:val="auto"/>
+                <w:color w:val="4C94D8" w:themeColor="text2" w:themeTint="80"/>
                 <w:spacing w:val="9"/>
                 <w:sz w:val="18"/>
                 <w:szCs w:val="18"/>
                 <w:lang w:eastAsia="zh-CN"/>
               </w:rPr>
-              <w:t>填写应用、操作系统、数据库、中间件、基础设施配置信息</w:t>
+              <w:t>填写系统应用架构、技术架构、数据架构及物理部署情况，涉及基础设施的填写基础设施的方案及架构，必要时附架构图</w:t>
             </w:r>
           </w:p>
         </w:tc>
@@ -2798,7 +2729,6 @@
             <w:pPr>
               <w:pStyle w:val="TableText"/>
               <w:spacing w:after="0"/>
-              <w:ind w:left="3"/>
               <w:jc w:val="center"/>
               <w:rPr>
                 <w:rFonts w:hint="eastAsia"/>
@@ -2807,6 +2737,7 @@
                 <w:szCs w:val="18"/>
               </w:rPr>
             </w:pPr>
+            <w:proofErr w:type="gramStart"/>
             <w:r>
               <w:rPr>
                 <w:color w:val="auto"/>
@@ -2815,7 +2746,18 @@
                 <w:szCs w:val="18"/>
                 <w:lang w:eastAsia="zh-CN"/>
               </w:rPr>
-              <w:t>系统架构</w:t>
+              <w:t>灾备及</w:t>
+            </w:r>
+            <w:proofErr w:type="gramEnd"/>
+            <w:r>
+              <w:rPr>
+                <w:color w:val="auto"/>
+                <w:spacing w:val="5"/>
+                <w:sz w:val="18"/>
+                <w:szCs w:val="18"/>
+                <w:lang w:eastAsia="zh-CN"/>
+              </w:rPr>
+              <w:t>备份</w:t>
             </w:r>
           </w:p>
         </w:tc>
@@ -2830,7 +2772,7 @@
               <w:spacing w:after="0"/>
               <w:rPr>
                 <w:rFonts w:hint="eastAsia"/>
-                <w:color w:val="auto"/>
+                <w:color w:val="4C94D8" w:themeColor="text2" w:themeTint="80"/>
                 <w:sz w:val="18"/>
                 <w:szCs w:val="18"/>
                 <w:lang w:eastAsia="zh-CN"/>
@@ -2839,108 +2781,31 @@
             <w:r>
               <w:rPr>
                 <w:rFonts w:hint="eastAsia"/>
-                <w:color w:val="auto"/>
+                <w:color w:val="4C94D8" w:themeColor="text2" w:themeTint="80"/>
                 <w:spacing w:val="9"/>
                 <w:sz w:val="18"/>
                 <w:szCs w:val="18"/>
                 <w:lang w:eastAsia="zh-CN"/>
               </w:rPr>
-              <w:t>填写系统应用架构、技术架构、数据架构及物理部署情况，涉及基础设施的填写基础设施的方案及架构，必要时附架构图</w:t>
-            </w:r>
-          </w:p>
-        </w:tc>
-      </w:tr>
-      <w:tr>
-        <w:trPr>
-          <w:trHeight w:val="20"/>
-          <w:jc w:val="center"/>
-        </w:trPr>
-        <w:tc>
-          <w:tcPr>
-            <w:tcW w:w="1958" w:type="dxa"/>
-            <w:vAlign w:val="center"/>
-          </w:tcPr>
-          <w:p>
-            <w:pPr>
-              <w:pStyle w:val="TableText"/>
-              <w:spacing w:after="0"/>
-              <w:jc w:val="center"/>
+              <w:t>填写生产主机备份方案、数据备份方案、</w:t>
+            </w:r>
+            <w:proofErr w:type="gramStart"/>
+            <w:r>
               <w:rPr>
                 <w:rFonts w:hint="eastAsia"/>
-                <w:color w:val="auto"/>
-                <w:sz w:val="18"/>
-                <w:szCs w:val="18"/>
-              </w:rPr>
-            </w:pPr>
-            <w:proofErr w:type="gramStart"/>
-            <w:r>
-              <w:rPr>
-                <w:color w:val="auto"/>
-                <w:spacing w:val="5"/>
+                <w:color w:val="4C94D8" w:themeColor="text2" w:themeTint="80"/>
+                <w:spacing w:val="9"/>
                 <w:sz w:val="18"/>
                 <w:szCs w:val="18"/>
                 <w:lang w:eastAsia="zh-CN"/>
               </w:rPr>
-              <w:t>灾备及</w:t>
+              <w:t>灾备方案</w:t>
             </w:r>
             <w:proofErr w:type="gramEnd"/>
             <w:r>
               <w:rPr>
-                <w:color w:val="auto"/>
-                <w:spacing w:val="5"/>
-                <w:sz w:val="18"/>
-                <w:szCs w:val="18"/>
-                <w:lang w:eastAsia="zh-CN"/>
-              </w:rPr>
-              <w:t>备份</w:t>
-            </w:r>
-          </w:p>
-        </w:tc>
-        <w:tc>
-          <w:tcPr>
-            <w:tcW w:w="6660" w:type="dxa"/>
-            <w:vAlign w:val="center"/>
-          </w:tcPr>
-          <w:p>
-            <w:pPr>
-              <w:pStyle w:val="TableText"/>
-              <w:spacing w:after="0"/>
-              <w:rPr>
                 <w:rFonts w:hint="eastAsia"/>
-                <w:color w:val="auto"/>
-                <w:sz w:val="18"/>
-                <w:szCs w:val="18"/>
-                <w:lang w:eastAsia="zh-CN"/>
-              </w:rPr>
-            </w:pPr>
-            <w:r>
-              <w:rPr>
-                <w:rFonts w:hint="eastAsia"/>
-                <w:color w:val="auto"/>
-                <w:spacing w:val="9"/>
-                <w:sz w:val="18"/>
-                <w:szCs w:val="18"/>
-                <w:lang w:eastAsia="zh-CN"/>
-              </w:rPr>
-              <w:t>填写生产主机备份方案、数据备份方案、</w:t>
-            </w:r>
-            <w:proofErr w:type="gramStart"/>
-            <w:r>
-              <w:rPr>
-                <w:rFonts w:hint="eastAsia"/>
-                <w:color w:val="auto"/>
-                <w:spacing w:val="9"/>
-                <w:sz w:val="18"/>
-                <w:szCs w:val="18"/>
-                <w:lang w:eastAsia="zh-CN"/>
-              </w:rPr>
-              <w:t>灾备方案</w:t>
-            </w:r>
-            <w:proofErr w:type="gramEnd"/>
-            <w:r>
-              <w:rPr>
-                <w:rFonts w:hint="eastAsia"/>
-                <w:color w:val="auto"/>
+                <w:color w:val="4C94D8" w:themeColor="text2" w:themeTint="80"/>
                 <w:spacing w:val="9"/>
                 <w:sz w:val="18"/>
                 <w:szCs w:val="18"/>
@@ -2954,39 +2819,37 @@
     </w:tbl>
     <w:p>
       <w:pPr>
-        <w:rPr>
-          <w:rFonts w:ascii="微软雅黑" w:eastAsia="微软雅黑" w:hAnsi="微软雅黑"/>
+        <w:spacing w:after="0" w:line="240" w:lineRule="auto"/>
+        <w:rPr>
+          <w:rFonts w:ascii="微软雅黑" w:eastAsia="微软雅黑" w:hAnsi="微软雅黑" w:hint="eastAsia"/>
+          <w:sz w:val="18"/>
+          <w:szCs w:val="18"/>
+        </w:rPr>
+      </w:pPr>
+    </w:p>
+    <w:p>
+      <w:pPr>
+        <w:spacing w:after="0" w:line="240" w:lineRule="auto"/>
+        <w:rPr>
+          <w:rFonts w:ascii="微软雅黑" w:eastAsia="微软雅黑" w:hAnsi="微软雅黑" w:hint="eastAsia"/>
+          <w:sz w:val="18"/>
+          <w:szCs w:val="18"/>
         </w:rPr>
       </w:pPr>
     </w:p>
     <w:p>
       <w:pPr>
         <w:pStyle w:val="2"/>
+        <w:rPr>
+          <w:rFonts w:hint="eastAsia"/>
+        </w:rPr>
       </w:pPr>
       <w:bookmarkStart w:id="3" w:name="_Toc235027607"/>
       <w:r>
         <w:rPr>
           <w:rFonts w:hint="eastAsia"/>
         </w:rPr>
-        <w:t>3</w:t>
-      </w:r>
-      <w:r>
-        <w:rPr>
-          <w:rFonts w:hint="eastAsia"/>
-        </w:rPr>
-        <w:t>.</w:t>
-      </w:r>
-      <w:r>
-        <w:rPr>
-          <w:rFonts w:hint="eastAsia"/>
-        </w:rPr>
-        <w:t xml:space="preserve"> </w:t>
-      </w:r>
-      <w:r>
-        <w:rPr>
-          <w:rFonts w:hint="eastAsia"/>
-        </w:rPr>
-        <w:t>组织结构</w:t>
+        <w:t>3. 组织结构</w:t>
       </w:r>
       <w:bookmarkEnd w:id="3"/>
     </w:p>
@@ -3017,7 +2880,7 @@
               <w:spacing w:after="0" w:line="240" w:lineRule="auto"/>
               <w:jc w:val="center"/>
               <w:rPr>
-                <w:rFonts w:ascii="微软雅黑" w:eastAsia="微软雅黑" w:hAnsi="微软雅黑"/>
+                <w:rFonts w:ascii="微软雅黑" w:eastAsia="微软雅黑" w:hAnsi="微软雅黑" w:hint="eastAsia"/>
                 <w:sz w:val="18"/>
                 <w:szCs w:val="18"/>
               </w:rPr>
@@ -3045,7 +2908,7 @@
               <w:spacing w:after="0" w:line="240" w:lineRule="auto"/>
               <w:jc w:val="center"/>
               <w:rPr>
-                <w:rFonts w:ascii="微软雅黑" w:eastAsia="微软雅黑" w:hAnsi="微软雅黑"/>
+                <w:rFonts w:ascii="微软雅黑" w:eastAsia="微软雅黑" w:hAnsi="微软雅黑" w:hint="eastAsia"/>
                 <w:sz w:val="18"/>
                 <w:szCs w:val="18"/>
               </w:rPr>
@@ -3095,7 +2958,7 @@
               <w:spacing w:after="0" w:line="240" w:lineRule="auto"/>
               <w:jc w:val="center"/>
               <w:rPr>
-                <w:rFonts w:ascii="微软雅黑" w:eastAsia="微软雅黑" w:hAnsi="微软雅黑"/>
+                <w:rFonts w:ascii="微软雅黑" w:eastAsia="微软雅黑" w:hAnsi="微软雅黑" w:hint="eastAsia"/>
                 <w:sz w:val="18"/>
                 <w:szCs w:val="18"/>
               </w:rPr>
@@ -3123,7 +2986,7 @@
               <w:spacing w:after="0" w:line="240" w:lineRule="auto"/>
               <w:jc w:val="center"/>
               <w:rPr>
-                <w:rFonts w:ascii="微软雅黑" w:eastAsia="微软雅黑" w:hAnsi="微软雅黑"/>
+                <w:rFonts w:ascii="微软雅黑" w:eastAsia="微软雅黑" w:hAnsi="微软雅黑" w:hint="eastAsia"/>
                 <w:sz w:val="18"/>
                 <w:szCs w:val="18"/>
               </w:rPr>
@@ -3151,7 +3014,7 @@
               <w:spacing w:after="0" w:line="240" w:lineRule="auto"/>
               <w:jc w:val="center"/>
               <w:rPr>
-                <w:rFonts w:ascii="微软雅黑" w:eastAsia="微软雅黑" w:hAnsi="微软雅黑"/>
+                <w:rFonts w:ascii="微软雅黑" w:eastAsia="微软雅黑" w:hAnsi="微软雅黑" w:hint="eastAsia"/>
                 <w:sz w:val="18"/>
                 <w:szCs w:val="18"/>
               </w:rPr>
@@ -3181,7 +3044,7 @@
               <w:spacing w:after="0" w:line="240" w:lineRule="auto"/>
               <w:jc w:val="center"/>
               <w:rPr>
-                <w:rFonts w:ascii="微软雅黑" w:eastAsia="微软雅黑" w:hAnsi="微软雅黑"/>
+                <w:rFonts w:ascii="微软雅黑" w:eastAsia="微软雅黑" w:hAnsi="微软雅黑" w:hint="eastAsia"/>
                 <w:sz w:val="18"/>
                 <w:szCs w:val="18"/>
               </w:rPr>
@@ -3218,7 +3081,7 @@
               <w:spacing w:after="0" w:line="240" w:lineRule="auto"/>
               <w:jc w:val="center"/>
               <w:rPr>
-                <w:rFonts w:ascii="微软雅黑" w:eastAsia="微软雅黑" w:hAnsi="微软雅黑"/>
+                <w:rFonts w:ascii="微软雅黑" w:eastAsia="微软雅黑" w:hAnsi="微软雅黑" w:hint="eastAsia"/>
                 <w:sz w:val="18"/>
                 <w:szCs w:val="18"/>
               </w:rPr>
@@ -3235,7 +3098,7 @@
               <w:spacing w:after="0" w:line="240" w:lineRule="auto"/>
               <w:jc w:val="center"/>
               <w:rPr>
-                <w:rFonts w:ascii="微软雅黑" w:eastAsia="微软雅黑" w:hAnsi="微软雅黑"/>
+                <w:rFonts w:ascii="微软雅黑" w:eastAsia="微软雅黑" w:hAnsi="微软雅黑" w:hint="eastAsia"/>
                 <w:sz w:val="18"/>
                 <w:szCs w:val="18"/>
               </w:rPr>
@@ -3252,7 +3115,7 @@
               <w:spacing w:after="0" w:line="240" w:lineRule="auto"/>
               <w:jc w:val="center"/>
               <w:rPr>
-                <w:rFonts w:ascii="微软雅黑" w:eastAsia="微软雅黑" w:hAnsi="微软雅黑"/>
+                <w:rFonts w:ascii="微软雅黑" w:eastAsia="微软雅黑" w:hAnsi="微软雅黑" w:hint="eastAsia"/>
                 <w:sz w:val="18"/>
                 <w:szCs w:val="18"/>
               </w:rPr>
@@ -3269,7 +3132,7 @@
               <w:spacing w:after="0" w:line="240" w:lineRule="auto"/>
               <w:jc w:val="center"/>
               <w:rPr>
-                <w:rFonts w:ascii="微软雅黑" w:eastAsia="微软雅黑" w:hAnsi="微软雅黑"/>
+                <w:rFonts w:ascii="微软雅黑" w:eastAsia="微软雅黑" w:hAnsi="微软雅黑" w:hint="eastAsia"/>
                 <w:sz w:val="18"/>
                 <w:szCs w:val="18"/>
               </w:rPr>
@@ -3315,7 +3178,7 @@
               <w:spacing w:after="0" w:line="240" w:lineRule="auto"/>
               <w:jc w:val="center"/>
               <w:rPr>
-                <w:rFonts w:ascii="微软雅黑" w:eastAsia="微软雅黑" w:hAnsi="微软雅黑"/>
+                <w:rFonts w:ascii="微软雅黑" w:eastAsia="微软雅黑" w:hAnsi="微软雅黑" w:hint="eastAsia"/>
                 <w:sz w:val="18"/>
                 <w:szCs w:val="18"/>
               </w:rPr>
@@ -3332,7 +3195,7 @@
               <w:spacing w:after="0" w:line="240" w:lineRule="auto"/>
               <w:jc w:val="center"/>
               <w:rPr>
-                <w:rFonts w:ascii="微软雅黑" w:eastAsia="微软雅黑" w:hAnsi="微软雅黑"/>
+                <w:rFonts w:ascii="微软雅黑" w:eastAsia="微软雅黑" w:hAnsi="微软雅黑" w:hint="eastAsia"/>
                 <w:sz w:val="18"/>
                 <w:szCs w:val="18"/>
               </w:rPr>
@@ -3349,7 +3212,7 @@
               <w:spacing w:after="0" w:line="240" w:lineRule="auto"/>
               <w:jc w:val="center"/>
               <w:rPr>
-                <w:rFonts w:ascii="微软雅黑" w:eastAsia="微软雅黑" w:hAnsi="微软雅黑"/>
+                <w:rFonts w:ascii="微软雅黑" w:eastAsia="微软雅黑" w:hAnsi="微软雅黑" w:hint="eastAsia"/>
                 <w:sz w:val="18"/>
                 <w:szCs w:val="18"/>
               </w:rPr>
@@ -3366,7 +3229,7 @@
               <w:spacing w:after="0" w:line="240" w:lineRule="auto"/>
               <w:jc w:val="center"/>
               <w:rPr>
-                <w:rFonts w:ascii="微软雅黑" w:eastAsia="微软雅黑" w:hAnsi="微软雅黑"/>
+                <w:rFonts w:ascii="微软雅黑" w:eastAsia="微软雅黑" w:hAnsi="微软雅黑" w:hint="eastAsia"/>
                 <w:sz w:val="18"/>
                 <w:szCs w:val="18"/>
               </w:rPr>
@@ -3412,7 +3275,7 @@
               <w:spacing w:after="0" w:line="240" w:lineRule="auto"/>
               <w:jc w:val="center"/>
               <w:rPr>
-                <w:rFonts w:ascii="微软雅黑" w:eastAsia="微软雅黑" w:hAnsi="微软雅黑"/>
+                <w:rFonts w:ascii="微软雅黑" w:eastAsia="微软雅黑" w:hAnsi="微软雅黑" w:hint="eastAsia"/>
                 <w:sz w:val="18"/>
                 <w:szCs w:val="18"/>
               </w:rPr>
@@ -3429,7 +3292,7 @@
               <w:spacing w:after="0" w:line="240" w:lineRule="auto"/>
               <w:jc w:val="center"/>
               <w:rPr>
-                <w:rFonts w:ascii="微软雅黑" w:eastAsia="微软雅黑" w:hAnsi="微软雅黑"/>
+                <w:rFonts w:ascii="微软雅黑" w:eastAsia="微软雅黑" w:hAnsi="微软雅黑" w:hint="eastAsia"/>
                 <w:sz w:val="18"/>
                 <w:szCs w:val="18"/>
               </w:rPr>
@@ -3446,7 +3309,7 @@
               <w:spacing w:after="0" w:line="240" w:lineRule="auto"/>
               <w:jc w:val="center"/>
               <w:rPr>
-                <w:rFonts w:ascii="微软雅黑" w:eastAsia="微软雅黑" w:hAnsi="微软雅黑"/>
+                <w:rFonts w:ascii="微软雅黑" w:eastAsia="微软雅黑" w:hAnsi="微软雅黑" w:hint="eastAsia"/>
                 <w:sz w:val="18"/>
                 <w:szCs w:val="18"/>
               </w:rPr>
@@ -3463,7 +3326,7 @@
               <w:spacing w:after="0" w:line="240" w:lineRule="auto"/>
               <w:jc w:val="center"/>
               <w:rPr>
-                <w:rFonts w:ascii="微软雅黑" w:eastAsia="微软雅黑" w:hAnsi="微软雅黑"/>
+                <w:rFonts w:ascii="微软雅黑" w:eastAsia="微软雅黑" w:hAnsi="微软雅黑" w:hint="eastAsia"/>
                 <w:sz w:val="18"/>
                 <w:szCs w:val="18"/>
               </w:rPr>
@@ -3509,7 +3372,7 @@
               <w:spacing w:after="0" w:line="240" w:lineRule="auto"/>
               <w:jc w:val="center"/>
               <w:rPr>
-                <w:rFonts w:ascii="微软雅黑" w:eastAsia="微软雅黑" w:hAnsi="微软雅黑"/>
+                <w:rFonts w:ascii="微软雅黑" w:eastAsia="微软雅黑" w:hAnsi="微软雅黑" w:hint="eastAsia"/>
                 <w:sz w:val="18"/>
                 <w:szCs w:val="18"/>
               </w:rPr>
@@ -3526,7 +3389,7 @@
               <w:spacing w:after="0" w:line="240" w:lineRule="auto"/>
               <w:jc w:val="center"/>
               <w:rPr>
-                <w:rFonts w:ascii="微软雅黑" w:eastAsia="微软雅黑" w:hAnsi="微软雅黑"/>
+                <w:rFonts w:ascii="微软雅黑" w:eastAsia="微软雅黑" w:hAnsi="微软雅黑" w:hint="eastAsia"/>
                 <w:sz w:val="18"/>
                 <w:szCs w:val="18"/>
               </w:rPr>
@@ -3543,7 +3406,7 @@
               <w:spacing w:after="0" w:line="240" w:lineRule="auto"/>
               <w:jc w:val="center"/>
               <w:rPr>
-                <w:rFonts w:ascii="微软雅黑" w:eastAsia="微软雅黑" w:hAnsi="微软雅黑"/>
+                <w:rFonts w:ascii="微软雅黑" w:eastAsia="微软雅黑" w:hAnsi="微软雅黑" w:hint="eastAsia"/>
                 <w:sz w:val="18"/>
                 <w:szCs w:val="18"/>
               </w:rPr>
@@ -3560,7 +3423,7 @@
               <w:spacing w:after="0" w:line="240" w:lineRule="auto"/>
               <w:jc w:val="center"/>
               <w:rPr>
-                <w:rFonts w:ascii="微软雅黑" w:eastAsia="微软雅黑" w:hAnsi="微软雅黑"/>
+                <w:rFonts w:ascii="微软雅黑" w:eastAsia="微软雅黑" w:hAnsi="微软雅黑" w:hint="eastAsia"/>
                 <w:sz w:val="18"/>
                 <w:szCs w:val="18"/>
               </w:rPr>
@@ -3571,14 +3434,20 @@
     </w:tbl>
     <w:p>
       <w:pPr>
-        <w:rPr>
-          <w:rFonts w:ascii="微软雅黑" w:eastAsia="微软雅黑" w:hAnsi="微软雅黑"/>
+        <w:spacing w:after="0" w:line="240" w:lineRule="auto"/>
+        <w:rPr>
+          <w:rFonts w:ascii="微软雅黑" w:eastAsia="微软雅黑" w:hAnsi="微软雅黑" w:hint="eastAsia"/>
+          <w:sz w:val="18"/>
+          <w:szCs w:val="18"/>
         </w:rPr>
       </w:pPr>
     </w:p>
     <w:p>
       <w:pPr>
         <w:pStyle w:val="2"/>
+        <w:rPr>
+          <w:rFonts w:hint="eastAsia"/>
+        </w:rPr>
       </w:pPr>
       <w:bookmarkStart w:id="4" w:name="_Toc235027608"/>
       <w:r>
@@ -3591,13 +3460,18 @@
     </w:p>
     <w:p>
       <w:pPr>
+        <w:spacing w:after="0" w:line="240" w:lineRule="auto"/>
         <w:rPr>
           <w:rFonts w:ascii="微软雅黑" w:eastAsia="微软雅黑" w:hAnsi="微软雅黑" w:hint="eastAsia"/>
+          <w:sz w:val="18"/>
+          <w:szCs w:val="18"/>
         </w:rPr>
       </w:pPr>
       <w:r>
         <w:rPr>
           <w:rFonts w:ascii="微软雅黑" w:eastAsia="微软雅黑" w:hAnsi="微软雅黑" w:hint="eastAsia"/>
+          <w:sz w:val="18"/>
+          <w:szCs w:val="18"/>
         </w:rPr>
         <w:t>填写变更控制表。</w:t>
       </w:r>
@@ -3605,13 +3479,15 @@
     <w:p>
       <w:pPr>
         <w:pStyle w:val="2"/>
+        <w:rPr>
+          <w:rFonts w:hint="eastAsia"/>
+        </w:rPr>
       </w:pPr>
       <w:bookmarkStart w:id="5" w:name="_Toc235027609"/>
       <w:r>
         <w:rPr>
           <w:rFonts w:hint="eastAsia"/>
         </w:rPr>
-        <w:lastRenderedPageBreak/>
         <w:t>5. 协同方案</w:t>
       </w:r>
       <w:bookmarkEnd w:id="5"/>
@@ -3642,6 +3518,7 @@
                 <w:rFonts w:ascii="微软雅黑" w:eastAsia="微软雅黑" w:hAnsi="微软雅黑" w:cs="微软雅黑" w:hint="eastAsia"/>
                 <w:b/>
                 <w:bCs/>
+                <w:color w:val="4C94D8" w:themeColor="text2" w:themeTint="80"/>
                 <w:spacing w:val="4"/>
                 <w:sz w:val="18"/>
                 <w:szCs w:val="18"/>
@@ -3652,6 +3529,7 @@
                 <w:rFonts w:ascii="微软雅黑" w:eastAsia="微软雅黑" w:hAnsi="微软雅黑" w:cs="微软雅黑"/>
                 <w:b/>
                 <w:bCs/>
+                <w:color w:val="4C94D8" w:themeColor="text2" w:themeTint="80"/>
                 <w:spacing w:val="4"/>
                 <w:sz w:val="18"/>
                 <w:szCs w:val="18"/>
@@ -3672,6 +3550,7 @@
                 <w:rFonts w:ascii="微软雅黑" w:eastAsia="微软雅黑" w:hAnsi="微软雅黑" w:cs="微软雅黑" w:hint="eastAsia"/>
                 <w:b/>
                 <w:bCs/>
+                <w:color w:val="4C94D8" w:themeColor="text2" w:themeTint="80"/>
                 <w:spacing w:val="4"/>
                 <w:sz w:val="18"/>
                 <w:szCs w:val="18"/>
@@ -3682,6 +3561,7 @@
                 <w:rFonts w:ascii="微软雅黑" w:eastAsia="微软雅黑" w:hAnsi="微软雅黑" w:cs="微软雅黑"/>
                 <w:b/>
                 <w:bCs/>
+                <w:color w:val="4C94D8" w:themeColor="text2" w:themeTint="80"/>
                 <w:spacing w:val="4"/>
                 <w:sz w:val="18"/>
                 <w:szCs w:val="18"/>
@@ -3702,6 +3582,7 @@
                 <w:rFonts w:ascii="微软雅黑" w:eastAsia="微软雅黑" w:hAnsi="微软雅黑" w:cs="微软雅黑" w:hint="eastAsia"/>
                 <w:b/>
                 <w:bCs/>
+                <w:color w:val="4C94D8" w:themeColor="text2" w:themeTint="80"/>
                 <w:spacing w:val="4"/>
                 <w:sz w:val="18"/>
                 <w:szCs w:val="18"/>
@@ -3712,6 +3593,7 @@
                 <w:rFonts w:ascii="微软雅黑" w:eastAsia="微软雅黑" w:hAnsi="微软雅黑" w:cs="微软雅黑"/>
                 <w:b/>
                 <w:bCs/>
+                <w:color w:val="4C94D8" w:themeColor="text2" w:themeTint="80"/>
                 <w:spacing w:val="4"/>
                 <w:sz w:val="18"/>
                 <w:szCs w:val="18"/>
@@ -3732,6 +3614,7 @@
                 <w:rFonts w:ascii="微软雅黑" w:eastAsia="微软雅黑" w:hAnsi="微软雅黑" w:cs="微软雅黑" w:hint="eastAsia"/>
                 <w:b/>
                 <w:bCs/>
+                <w:color w:val="4C94D8" w:themeColor="text2" w:themeTint="80"/>
                 <w:spacing w:val="4"/>
                 <w:sz w:val="18"/>
                 <w:szCs w:val="18"/>
@@ -3742,6 +3625,7 @@
                 <w:rFonts w:ascii="微软雅黑" w:eastAsia="微软雅黑" w:hAnsi="微软雅黑" w:cs="微软雅黑"/>
                 <w:b/>
                 <w:bCs/>
+                <w:color w:val="4C94D8" w:themeColor="text2" w:themeTint="80"/>
                 <w:spacing w:val="4"/>
                 <w:sz w:val="18"/>
                 <w:szCs w:val="18"/>
@@ -3762,6 +3646,7 @@
                 <w:rFonts w:ascii="微软雅黑" w:eastAsia="微软雅黑" w:hAnsi="微软雅黑" w:cs="微软雅黑" w:hint="eastAsia"/>
                 <w:b/>
                 <w:bCs/>
+                <w:color w:val="4C94D8" w:themeColor="text2" w:themeTint="80"/>
                 <w:spacing w:val="4"/>
                 <w:sz w:val="18"/>
                 <w:szCs w:val="18"/>
@@ -3772,11 +3657,25 @@
                 <w:rFonts w:ascii="微软雅黑" w:eastAsia="微软雅黑" w:hAnsi="微软雅黑" w:cs="微软雅黑"/>
                 <w:b/>
                 <w:bCs/>
-                <w:spacing w:val="4"/>
-                <w:sz w:val="18"/>
-                <w:szCs w:val="18"/>
-              </w:rPr>
-              <w:t xml:space="preserve"> 负责部门/负责人</w:t>
+                <w:color w:val="4C94D8" w:themeColor="text2" w:themeTint="80"/>
+                <w:spacing w:val="4"/>
+                <w:sz w:val="18"/>
+                <w:szCs w:val="18"/>
+              </w:rPr>
+              <w:t xml:space="preserve"> 负责部门/负责</w:t>
+            </w:r>
+            <w:r>
+              <w:rPr>
+                <w:rFonts w:ascii="微软雅黑" w:eastAsia="微软雅黑" w:hAnsi="微软雅黑" w:cs="微软雅黑"/>
+                <w:b/>
+                <w:bCs/>
+                <w:color w:val="4C94D8" w:themeColor="text2" w:themeTint="80"/>
+                <w:spacing w:val="4"/>
+                <w:sz w:val="18"/>
+                <w:szCs w:val="18"/>
+              </w:rPr>
+              <w:lastRenderedPageBreak/>
+              <w:t>人</w:t>
             </w:r>
           </w:p>
         </w:tc>
@@ -3794,6 +3693,7 @@
                 <w:rFonts w:ascii="微软雅黑" w:eastAsia="微软雅黑" w:hAnsi="微软雅黑" w:cs="微软雅黑" w:hint="eastAsia"/>
                 <w:b/>
                 <w:bCs/>
+                <w:color w:val="4C94D8" w:themeColor="text2" w:themeTint="80"/>
                 <w:spacing w:val="4"/>
                 <w:sz w:val="18"/>
                 <w:szCs w:val="18"/>
@@ -3813,6 +3713,7 @@
                 <w:rFonts w:ascii="微软雅黑" w:eastAsia="微软雅黑" w:hAnsi="微软雅黑" w:cs="微软雅黑" w:hint="eastAsia"/>
                 <w:b/>
                 <w:bCs/>
+                <w:color w:val="4C94D8" w:themeColor="text2" w:themeTint="80"/>
                 <w:spacing w:val="4"/>
                 <w:sz w:val="18"/>
                 <w:szCs w:val="18"/>
@@ -3832,6 +3733,7 @@
                 <w:rFonts w:ascii="微软雅黑" w:eastAsia="微软雅黑" w:hAnsi="微软雅黑" w:cs="微软雅黑" w:hint="eastAsia"/>
                 <w:b/>
                 <w:bCs/>
+                <w:color w:val="4C94D8" w:themeColor="text2" w:themeTint="80"/>
                 <w:spacing w:val="4"/>
                 <w:sz w:val="18"/>
                 <w:szCs w:val="18"/>
@@ -3851,6 +3753,7 @@
                 <w:rFonts w:ascii="微软雅黑" w:eastAsia="微软雅黑" w:hAnsi="微软雅黑" w:cs="微软雅黑" w:hint="eastAsia"/>
                 <w:b/>
                 <w:bCs/>
+                <w:color w:val="4C94D8" w:themeColor="text2" w:themeTint="80"/>
                 <w:spacing w:val="4"/>
                 <w:sz w:val="18"/>
                 <w:szCs w:val="18"/>
@@ -3870,6 +3773,7 @@
                 <w:rFonts w:ascii="微软雅黑" w:eastAsia="微软雅黑" w:hAnsi="微软雅黑" w:cs="微软雅黑" w:hint="eastAsia"/>
                 <w:b/>
                 <w:bCs/>
+                <w:color w:val="4C94D8" w:themeColor="text2" w:themeTint="80"/>
                 <w:spacing w:val="4"/>
                 <w:sz w:val="18"/>
                 <w:szCs w:val="18"/>
@@ -3891,6 +3795,7 @@
                 <w:rFonts w:ascii="微软雅黑" w:eastAsia="微软雅黑" w:hAnsi="微软雅黑" w:cs="微软雅黑" w:hint="eastAsia"/>
                 <w:b/>
                 <w:bCs/>
+                <w:color w:val="4C94D8" w:themeColor="text2" w:themeTint="80"/>
                 <w:spacing w:val="4"/>
                 <w:sz w:val="18"/>
                 <w:szCs w:val="18"/>
@@ -3910,6 +3815,7 @@
                 <w:rFonts w:ascii="微软雅黑" w:eastAsia="微软雅黑" w:hAnsi="微软雅黑" w:cs="微软雅黑" w:hint="eastAsia"/>
                 <w:b/>
                 <w:bCs/>
+                <w:color w:val="4C94D8" w:themeColor="text2" w:themeTint="80"/>
                 <w:spacing w:val="4"/>
                 <w:sz w:val="18"/>
                 <w:szCs w:val="18"/>
@@ -3929,6 +3835,7 @@
                 <w:rFonts w:ascii="微软雅黑" w:eastAsia="微软雅黑" w:hAnsi="微软雅黑" w:cs="微软雅黑" w:hint="eastAsia"/>
                 <w:b/>
                 <w:bCs/>
+                <w:color w:val="4C94D8" w:themeColor="text2" w:themeTint="80"/>
                 <w:spacing w:val="4"/>
                 <w:sz w:val="18"/>
                 <w:szCs w:val="18"/>
@@ -3948,6 +3855,7 @@
                 <w:rFonts w:ascii="微软雅黑" w:eastAsia="微软雅黑" w:hAnsi="微软雅黑" w:cs="微软雅黑" w:hint="eastAsia"/>
                 <w:b/>
                 <w:bCs/>
+                <w:color w:val="4C94D8" w:themeColor="text2" w:themeTint="80"/>
                 <w:spacing w:val="4"/>
                 <w:sz w:val="18"/>
                 <w:szCs w:val="18"/>
@@ -3967,6 +3875,7 @@
                 <w:rFonts w:ascii="微软雅黑" w:eastAsia="微软雅黑" w:hAnsi="微软雅黑" w:cs="微软雅黑" w:hint="eastAsia"/>
                 <w:b/>
                 <w:bCs/>
+                <w:color w:val="4C94D8" w:themeColor="text2" w:themeTint="80"/>
                 <w:spacing w:val="4"/>
                 <w:sz w:val="18"/>
                 <w:szCs w:val="18"/>
@@ -3978,14 +3887,60 @@
     </w:tbl>
     <w:p>
       <w:pPr>
+        <w:spacing w:after="0" w:line="240" w:lineRule="auto"/>
+        <w:rPr>
+          <w:rFonts w:ascii="微软雅黑" w:eastAsia="微软雅黑" w:hAnsi="微软雅黑"/>
+          <w:color w:val="4C94D8" w:themeColor="text2" w:themeTint="80"/>
+          <w:sz w:val="18"/>
+          <w:szCs w:val="18"/>
+        </w:rPr>
+      </w:pPr>
+      <w:r>
         <w:rPr>
           <w:rFonts w:ascii="微软雅黑" w:eastAsia="微软雅黑" w:hAnsi="微软雅黑" w:hint="eastAsia"/>
+          <w:color w:val="4C94D8" w:themeColor="text2" w:themeTint="80"/>
+          <w:sz w:val="18"/>
+          <w:szCs w:val="18"/>
+        </w:rPr>
+        <w:t>或</w:t>
+      </w:r>
+    </w:p>
+    <w:p>
+      <w:pPr>
+        <w:spacing w:after="0" w:line="240" w:lineRule="auto"/>
+        <w:rPr>
+          <w:rFonts w:ascii="微软雅黑" w:eastAsia="微软雅黑" w:hAnsi="微软雅黑" w:hint="eastAsia"/>
+          <w:color w:val="4C94D8" w:themeColor="text2" w:themeTint="80"/>
+          <w:sz w:val="18"/>
+          <w:szCs w:val="18"/>
+        </w:rPr>
+      </w:pPr>
+      <w:r>
+        <w:rPr>
+          <w:rFonts w:ascii="微软雅黑" w:eastAsia="微软雅黑" w:hAnsi="微软雅黑" w:hint="eastAsia"/>
+          <w:color w:val="4C94D8" w:themeColor="text2" w:themeTint="80"/>
+          <w:sz w:val="18"/>
+          <w:szCs w:val="18"/>
+        </w:rPr>
+        <w:t>不涉及</w:t>
+      </w:r>
+    </w:p>
+    <w:p>
+      <w:pPr>
+        <w:spacing w:after="0" w:line="240" w:lineRule="auto"/>
+        <w:rPr>
+          <w:rFonts w:ascii="微软雅黑" w:eastAsia="微软雅黑" w:hAnsi="微软雅黑" w:hint="eastAsia"/>
+          <w:sz w:val="18"/>
+          <w:szCs w:val="18"/>
         </w:rPr>
       </w:pPr>
     </w:p>
     <w:p>
       <w:pPr>
         <w:pStyle w:val="2"/>
+        <w:rPr>
+          <w:rFonts w:hint="eastAsia"/>
+        </w:rPr>
       </w:pPr>
       <w:bookmarkStart w:id="6" w:name="_Toc235027610"/>
       <w:r>
@@ -4024,6 +3979,7 @@
                 <w:rFonts w:ascii="微软雅黑" w:eastAsia="微软雅黑" w:hAnsi="微软雅黑" w:cs="微软雅黑" w:hint="eastAsia"/>
                 <w:b/>
                 <w:bCs/>
+                <w:color w:val="4C94D8" w:themeColor="text2" w:themeTint="80"/>
                 <w:spacing w:val="4"/>
                 <w:sz w:val="18"/>
                 <w:szCs w:val="18"/>
@@ -4034,6 +3990,7 @@
                 <w:rFonts w:ascii="微软雅黑" w:eastAsia="微软雅黑" w:hAnsi="微软雅黑" w:cs="微软雅黑"/>
                 <w:b/>
                 <w:bCs/>
+                <w:color w:val="4C94D8" w:themeColor="text2" w:themeTint="80"/>
                 <w:spacing w:val="4"/>
                 <w:sz w:val="18"/>
                 <w:szCs w:val="18"/>
@@ -4054,6 +4011,7 @@
                 <w:rFonts w:ascii="微软雅黑" w:eastAsia="微软雅黑" w:hAnsi="微软雅黑" w:cs="微软雅黑" w:hint="eastAsia"/>
                 <w:b/>
                 <w:bCs/>
+                <w:color w:val="4C94D8" w:themeColor="text2" w:themeTint="80"/>
                 <w:spacing w:val="4"/>
                 <w:sz w:val="18"/>
                 <w:szCs w:val="18"/>
@@ -4064,6 +4022,7 @@
                 <w:rFonts w:ascii="微软雅黑" w:eastAsia="微软雅黑" w:hAnsi="微软雅黑" w:cs="微软雅黑"/>
                 <w:b/>
                 <w:bCs/>
+                <w:color w:val="4C94D8" w:themeColor="text2" w:themeTint="80"/>
                 <w:spacing w:val="4"/>
                 <w:sz w:val="18"/>
                 <w:szCs w:val="18"/>
@@ -4084,6 +4043,7 @@
                 <w:rFonts w:ascii="微软雅黑" w:eastAsia="微软雅黑" w:hAnsi="微软雅黑" w:cs="微软雅黑" w:hint="eastAsia"/>
                 <w:b/>
                 <w:bCs/>
+                <w:color w:val="4C94D8" w:themeColor="text2" w:themeTint="80"/>
                 <w:spacing w:val="4"/>
                 <w:sz w:val="18"/>
                 <w:szCs w:val="18"/>
@@ -4094,6 +4054,7 @@
                 <w:rFonts w:ascii="微软雅黑" w:eastAsia="微软雅黑" w:hAnsi="微软雅黑" w:cs="微软雅黑"/>
                 <w:b/>
                 <w:bCs/>
+                <w:color w:val="4C94D8" w:themeColor="text2" w:themeTint="80"/>
                 <w:spacing w:val="4"/>
                 <w:sz w:val="18"/>
                 <w:szCs w:val="18"/>
@@ -4114,6 +4075,7 @@
                 <w:rFonts w:ascii="微软雅黑" w:eastAsia="微软雅黑" w:hAnsi="微软雅黑" w:cs="微软雅黑" w:hint="eastAsia"/>
                 <w:b/>
                 <w:bCs/>
+                <w:color w:val="4C94D8" w:themeColor="text2" w:themeTint="80"/>
                 <w:spacing w:val="4"/>
                 <w:sz w:val="18"/>
                 <w:szCs w:val="18"/>
@@ -4124,6 +4086,7 @@
                 <w:rFonts w:ascii="微软雅黑" w:eastAsia="微软雅黑" w:hAnsi="微软雅黑" w:cs="微软雅黑"/>
                 <w:b/>
                 <w:bCs/>
+                <w:color w:val="4C94D8" w:themeColor="text2" w:themeTint="80"/>
                 <w:spacing w:val="4"/>
                 <w:sz w:val="18"/>
                 <w:szCs w:val="18"/>
@@ -4144,6 +4107,7 @@
                 <w:rFonts w:ascii="微软雅黑" w:eastAsia="微软雅黑" w:hAnsi="微软雅黑" w:cs="微软雅黑" w:hint="eastAsia"/>
                 <w:b/>
                 <w:bCs/>
+                <w:color w:val="4C94D8" w:themeColor="text2" w:themeTint="80"/>
                 <w:spacing w:val="4"/>
                 <w:sz w:val="18"/>
                 <w:szCs w:val="18"/>
@@ -4154,6 +4118,7 @@
                 <w:rFonts w:ascii="微软雅黑" w:eastAsia="微软雅黑" w:hAnsi="微软雅黑" w:cs="微软雅黑"/>
                 <w:b/>
                 <w:bCs/>
+                <w:color w:val="4C94D8" w:themeColor="text2" w:themeTint="80"/>
                 <w:spacing w:val="4"/>
                 <w:sz w:val="18"/>
                 <w:szCs w:val="18"/>
@@ -4174,6 +4139,7 @@
                 <w:rFonts w:ascii="微软雅黑" w:eastAsia="微软雅黑" w:hAnsi="微软雅黑" w:cs="微软雅黑" w:hint="eastAsia"/>
                 <w:b/>
                 <w:bCs/>
+                <w:color w:val="4C94D8" w:themeColor="text2" w:themeTint="80"/>
                 <w:spacing w:val="4"/>
                 <w:sz w:val="18"/>
                 <w:szCs w:val="18"/>
@@ -4184,6 +4150,7 @@
                 <w:rFonts w:ascii="微软雅黑" w:eastAsia="微软雅黑" w:hAnsi="微软雅黑" w:cs="微软雅黑" w:hint="eastAsia"/>
                 <w:b/>
                 <w:bCs/>
+                <w:color w:val="4C94D8" w:themeColor="text2" w:themeTint="80"/>
                 <w:spacing w:val="4"/>
                 <w:sz w:val="18"/>
                 <w:szCs w:val="18"/>
@@ -4195,6 +4162,7 @@
                 <w:rFonts w:ascii="微软雅黑" w:eastAsia="微软雅黑" w:hAnsi="微软雅黑" w:cs="微软雅黑"/>
                 <w:b/>
                 <w:bCs/>
+                <w:color w:val="4C94D8" w:themeColor="text2" w:themeTint="80"/>
                 <w:spacing w:val="4"/>
                 <w:sz w:val="18"/>
                 <w:szCs w:val="18"/>
@@ -4215,6 +4183,7 @@
                 <w:rFonts w:ascii="微软雅黑" w:eastAsia="微软雅黑" w:hAnsi="微软雅黑" w:cs="微软雅黑" w:hint="eastAsia"/>
                 <w:b/>
                 <w:bCs/>
+                <w:color w:val="4C94D8" w:themeColor="text2" w:themeTint="80"/>
                 <w:spacing w:val="4"/>
                 <w:sz w:val="18"/>
                 <w:szCs w:val="18"/>
@@ -4225,6 +4194,7 @@
                 <w:rFonts w:ascii="微软雅黑" w:eastAsia="微软雅黑" w:hAnsi="微软雅黑" w:cs="微软雅黑" w:hint="eastAsia"/>
                 <w:b/>
                 <w:bCs/>
+                <w:color w:val="4C94D8" w:themeColor="text2" w:themeTint="80"/>
                 <w:spacing w:val="4"/>
                 <w:sz w:val="18"/>
                 <w:szCs w:val="18"/>
@@ -4236,6 +4206,7 @@
                 <w:rFonts w:ascii="微软雅黑" w:eastAsia="微软雅黑" w:hAnsi="微软雅黑" w:cs="微软雅黑"/>
                 <w:b/>
                 <w:bCs/>
+                <w:color w:val="4C94D8" w:themeColor="text2" w:themeTint="80"/>
                 <w:spacing w:val="4"/>
                 <w:sz w:val="18"/>
                 <w:szCs w:val="18"/>
@@ -4258,6 +4229,7 @@
                 <w:rFonts w:ascii="微软雅黑" w:eastAsia="微软雅黑" w:hAnsi="微软雅黑" w:cs="微软雅黑" w:hint="eastAsia"/>
                 <w:b/>
                 <w:bCs/>
+                <w:color w:val="4C94D8" w:themeColor="text2" w:themeTint="80"/>
                 <w:spacing w:val="4"/>
                 <w:sz w:val="18"/>
                 <w:szCs w:val="18"/>
@@ -4277,6 +4249,7 @@
                 <w:rFonts w:ascii="微软雅黑" w:eastAsia="微软雅黑" w:hAnsi="微软雅黑" w:cs="微软雅黑" w:hint="eastAsia"/>
                 <w:b/>
                 <w:bCs/>
+                <w:color w:val="4C94D8" w:themeColor="text2" w:themeTint="80"/>
                 <w:spacing w:val="4"/>
                 <w:sz w:val="18"/>
                 <w:szCs w:val="18"/>
@@ -4296,6 +4269,7 @@
                 <w:rFonts w:ascii="微软雅黑" w:eastAsia="微软雅黑" w:hAnsi="微软雅黑" w:cs="微软雅黑" w:hint="eastAsia"/>
                 <w:b/>
                 <w:bCs/>
+                <w:color w:val="4C94D8" w:themeColor="text2" w:themeTint="80"/>
                 <w:spacing w:val="4"/>
                 <w:sz w:val="18"/>
                 <w:szCs w:val="18"/>
@@ -4315,6 +4289,7 @@
                 <w:rFonts w:ascii="微软雅黑" w:eastAsia="微软雅黑" w:hAnsi="微软雅黑" w:cs="微软雅黑" w:hint="eastAsia"/>
                 <w:b/>
                 <w:bCs/>
+                <w:color w:val="4C94D8" w:themeColor="text2" w:themeTint="80"/>
                 <w:spacing w:val="4"/>
                 <w:sz w:val="18"/>
                 <w:szCs w:val="18"/>
@@ -4334,6 +4309,7 @@
                 <w:rFonts w:ascii="微软雅黑" w:eastAsia="微软雅黑" w:hAnsi="微软雅黑" w:cs="微软雅黑" w:hint="eastAsia"/>
                 <w:b/>
                 <w:bCs/>
+                <w:color w:val="4C94D8" w:themeColor="text2" w:themeTint="80"/>
                 <w:spacing w:val="4"/>
                 <w:sz w:val="18"/>
                 <w:szCs w:val="18"/>
@@ -4353,6 +4329,7 @@
                 <w:rFonts w:ascii="微软雅黑" w:eastAsia="微软雅黑" w:hAnsi="微软雅黑" w:cs="微软雅黑" w:hint="eastAsia"/>
                 <w:b/>
                 <w:bCs/>
+                <w:color w:val="4C94D8" w:themeColor="text2" w:themeTint="80"/>
                 <w:spacing w:val="4"/>
                 <w:sz w:val="18"/>
                 <w:szCs w:val="18"/>
@@ -4372,6 +4349,7 @@
                 <w:rFonts w:ascii="微软雅黑" w:eastAsia="微软雅黑" w:hAnsi="微软雅黑" w:cs="微软雅黑" w:hint="eastAsia"/>
                 <w:b/>
                 <w:bCs/>
+                <w:color w:val="4C94D8" w:themeColor="text2" w:themeTint="80"/>
                 <w:spacing w:val="4"/>
                 <w:sz w:val="18"/>
                 <w:szCs w:val="18"/>
@@ -4393,6 +4371,7 @@
                 <w:rFonts w:ascii="微软雅黑" w:eastAsia="微软雅黑" w:hAnsi="微软雅黑" w:cs="微软雅黑" w:hint="eastAsia"/>
                 <w:b/>
                 <w:bCs/>
+                <w:color w:val="4C94D8" w:themeColor="text2" w:themeTint="80"/>
                 <w:spacing w:val="4"/>
                 <w:sz w:val="18"/>
                 <w:szCs w:val="18"/>
@@ -4412,6 +4391,7 @@
                 <w:rFonts w:ascii="微软雅黑" w:eastAsia="微软雅黑" w:hAnsi="微软雅黑" w:cs="微软雅黑" w:hint="eastAsia"/>
                 <w:b/>
                 <w:bCs/>
+                <w:color w:val="4C94D8" w:themeColor="text2" w:themeTint="80"/>
                 <w:spacing w:val="4"/>
                 <w:sz w:val="18"/>
                 <w:szCs w:val="18"/>
@@ -4431,6 +4411,7 @@
                 <w:rFonts w:ascii="微软雅黑" w:eastAsia="微软雅黑" w:hAnsi="微软雅黑" w:cs="微软雅黑" w:hint="eastAsia"/>
                 <w:b/>
                 <w:bCs/>
+                <w:color w:val="4C94D8" w:themeColor="text2" w:themeTint="80"/>
                 <w:spacing w:val="4"/>
                 <w:sz w:val="18"/>
                 <w:szCs w:val="18"/>
@@ -4450,6 +4431,7 @@
                 <w:rFonts w:ascii="微软雅黑" w:eastAsia="微软雅黑" w:hAnsi="微软雅黑" w:cs="微软雅黑" w:hint="eastAsia"/>
                 <w:b/>
                 <w:bCs/>
+                <w:color w:val="4C94D8" w:themeColor="text2" w:themeTint="80"/>
                 <w:spacing w:val="4"/>
                 <w:sz w:val="18"/>
                 <w:szCs w:val="18"/>
@@ -4469,6 +4451,7 @@
                 <w:rFonts w:ascii="微软雅黑" w:eastAsia="微软雅黑" w:hAnsi="微软雅黑" w:cs="微软雅黑" w:hint="eastAsia"/>
                 <w:b/>
                 <w:bCs/>
+                <w:color w:val="4C94D8" w:themeColor="text2" w:themeTint="80"/>
                 <w:spacing w:val="4"/>
                 <w:sz w:val="18"/>
                 <w:szCs w:val="18"/>
@@ -4488,6 +4471,7 @@
                 <w:rFonts w:ascii="微软雅黑" w:eastAsia="微软雅黑" w:hAnsi="微软雅黑" w:cs="微软雅黑" w:hint="eastAsia"/>
                 <w:b/>
                 <w:bCs/>
+                <w:color w:val="4C94D8" w:themeColor="text2" w:themeTint="80"/>
                 <w:spacing w:val="4"/>
                 <w:sz w:val="18"/>
                 <w:szCs w:val="18"/>
@@ -4507,6 +4491,7 @@
                 <w:rFonts w:ascii="微软雅黑" w:eastAsia="微软雅黑" w:hAnsi="微软雅黑" w:cs="微软雅黑" w:hint="eastAsia"/>
                 <w:b/>
                 <w:bCs/>
+                <w:color w:val="4C94D8" w:themeColor="text2" w:themeTint="80"/>
                 <w:spacing w:val="4"/>
                 <w:sz w:val="18"/>
                 <w:szCs w:val="18"/>
@@ -4518,14 +4503,50 @@
     </w:tbl>
     <w:p>
       <w:pPr>
+        <w:spacing w:after="0" w:line="240" w:lineRule="auto"/>
+        <w:rPr>
+          <w:rFonts w:ascii="微软雅黑" w:eastAsia="微软雅黑" w:hAnsi="微软雅黑"/>
+          <w:color w:val="4C94D8" w:themeColor="text2" w:themeTint="80"/>
+          <w:sz w:val="18"/>
+          <w:szCs w:val="18"/>
+        </w:rPr>
+      </w:pPr>
+      <w:r>
         <w:rPr>
           <w:rFonts w:ascii="微软雅黑" w:eastAsia="微软雅黑" w:hAnsi="微软雅黑" w:hint="eastAsia"/>
+          <w:color w:val="4C94D8" w:themeColor="text2" w:themeTint="80"/>
+          <w:sz w:val="18"/>
+          <w:szCs w:val="18"/>
+        </w:rPr>
+        <w:t>或</w:t>
+      </w:r>
+    </w:p>
+    <w:p>
+      <w:pPr>
+        <w:spacing w:after="0" w:line="240" w:lineRule="auto"/>
+        <w:rPr>
+          <w:rFonts w:ascii="微软雅黑" w:eastAsia="微软雅黑" w:hAnsi="微软雅黑" w:hint="eastAsia"/>
+          <w:color w:val="4C94D8" w:themeColor="text2" w:themeTint="80"/>
+          <w:sz w:val="18"/>
+          <w:szCs w:val="18"/>
         </w:rPr>
       </w:pPr>
+      <w:r>
+        <w:rPr>
+          <w:rFonts w:ascii="微软雅黑" w:eastAsia="微软雅黑" w:hAnsi="微软雅黑" w:hint="eastAsia"/>
+          <w:color w:val="4C94D8" w:themeColor="text2" w:themeTint="80"/>
+          <w:sz w:val="18"/>
+          <w:szCs w:val="18"/>
+        </w:rPr>
+        <w:t>不涉及</w:t>
+      </w:r>
     </w:p>
     <w:p>
       <w:pPr>
         <w:pStyle w:val="2"/>
+        <w:rPr>
+          <w:rFonts w:hint="eastAsia"/>
+        </w:rPr>
       </w:pPr>
       <w:bookmarkStart w:id="7" w:name="_Toc235027611"/>
       <w:r>
@@ -4677,6 +4698,7 @@
               <w:spacing w:after="0" w:line="240" w:lineRule="auto"/>
               <w:rPr>
                 <w:rFonts w:ascii="微软雅黑" w:eastAsia="微软雅黑" w:hAnsi="微软雅黑" w:hint="eastAsia"/>
+                <w:color w:val="4C94D8" w:themeColor="text2" w:themeTint="80"/>
                 <w:spacing w:val="2"/>
                 <w:sz w:val="13"/>
                 <w:szCs w:val="13"/>
@@ -4685,6 +4707,7 @@
             <w:r>
               <w:rPr>
                 <w:rFonts w:ascii="微软雅黑" w:eastAsia="微软雅黑" w:hAnsi="微软雅黑"/>
+                <w:color w:val="4C94D8" w:themeColor="text2" w:themeTint="80"/>
                 <w:spacing w:val="2"/>
                 <w:sz w:val="13"/>
                 <w:szCs w:val="13"/>
@@ -4694,6 +4717,7 @@
             <w:r>
               <w:rPr>
                 <w:rFonts w:ascii="微软雅黑" w:eastAsia="微软雅黑" w:hAnsi="微软雅黑" w:hint="eastAsia"/>
+                <w:color w:val="4C94D8" w:themeColor="text2" w:themeTint="80"/>
                 <w:spacing w:val="2"/>
                 <w:sz w:val="13"/>
                 <w:szCs w:val="13"/>
@@ -4703,6 +4727,7 @@
             <w:r>
               <w:rPr>
                 <w:rFonts w:ascii="微软雅黑" w:eastAsia="微软雅黑" w:hAnsi="微软雅黑"/>
+                <w:color w:val="4C94D8" w:themeColor="text2" w:themeTint="80"/>
                 <w:spacing w:val="2"/>
                 <w:sz w:val="13"/>
                 <w:szCs w:val="13"/>
@@ -4717,6 +4742,7 @@
                 <w:rFonts w:ascii="微软雅黑" w:eastAsia="微软雅黑" w:hAnsi="微软雅黑" w:cs="微软雅黑" w:hint="eastAsia"/>
                 <w:b/>
                 <w:bCs/>
+                <w:color w:val="4C94D8" w:themeColor="text2" w:themeTint="80"/>
                 <w:spacing w:val="4"/>
                 <w:sz w:val="18"/>
                 <w:szCs w:val="18"/>
@@ -4725,6 +4751,7 @@
             <w:r>
               <w:rPr>
                 <w:rFonts w:ascii="微软雅黑" w:eastAsia="微软雅黑" w:hAnsi="微软雅黑"/>
+                <w:color w:val="4C94D8" w:themeColor="text2" w:themeTint="80"/>
                 <w:spacing w:val="2"/>
                 <w:sz w:val="13"/>
                 <w:szCs w:val="13"/>
@@ -4743,6 +4770,7 @@
               <w:spacing w:after="0" w:line="240" w:lineRule="auto"/>
               <w:rPr>
                 <w:rFonts w:ascii="微软雅黑" w:eastAsia="微软雅黑" w:hAnsi="微软雅黑" w:hint="eastAsia"/>
+                <w:color w:val="4C94D8" w:themeColor="text2" w:themeTint="80"/>
                 <w:spacing w:val="2"/>
                 <w:sz w:val="13"/>
                 <w:szCs w:val="13"/>
@@ -4751,6 +4779,7 @@
             <w:r>
               <w:rPr>
                 <w:rFonts w:ascii="微软雅黑" w:eastAsia="微软雅黑" w:hAnsi="微软雅黑" w:hint="eastAsia"/>
+                <w:color w:val="4C94D8" w:themeColor="text2" w:themeTint="80"/>
                 <w:spacing w:val="2"/>
                 <w:sz w:val="13"/>
                 <w:szCs w:val="13"/>
@@ -4761,6 +4790,7 @@
             <w:r>
               <w:rPr>
                 <w:rFonts w:ascii="微软雅黑" w:eastAsia="微软雅黑" w:hAnsi="微软雅黑" w:hint="eastAsia"/>
+                <w:color w:val="4C94D8" w:themeColor="text2" w:themeTint="80"/>
                 <w:spacing w:val="2"/>
                 <w:sz w:val="13"/>
                 <w:szCs w:val="13"/>
@@ -4771,6 +4801,7 @@
             <w:r>
               <w:rPr>
                 <w:rFonts w:ascii="微软雅黑" w:eastAsia="微软雅黑" w:hAnsi="微软雅黑" w:hint="eastAsia"/>
+                <w:color w:val="4C94D8" w:themeColor="text2" w:themeTint="80"/>
                 <w:spacing w:val="2"/>
                 <w:sz w:val="13"/>
                 <w:szCs w:val="13"/>
@@ -4781,6 +4812,7 @@
             <w:r>
               <w:rPr>
                 <w:rFonts w:ascii="微软雅黑" w:eastAsia="微软雅黑" w:hAnsi="微软雅黑" w:hint="eastAsia"/>
+                <w:color w:val="4C94D8" w:themeColor="text2" w:themeTint="80"/>
                 <w:spacing w:val="2"/>
                 <w:sz w:val="13"/>
                 <w:szCs w:val="13"/>
@@ -4791,6 +4823,7 @@
             <w:r>
               <w:rPr>
                 <w:rFonts w:ascii="微软雅黑" w:eastAsia="微软雅黑" w:hAnsi="微软雅黑" w:hint="eastAsia"/>
+                <w:color w:val="4C94D8" w:themeColor="text2" w:themeTint="80"/>
                 <w:spacing w:val="2"/>
                 <w:sz w:val="13"/>
                 <w:szCs w:val="13"/>
@@ -4805,14 +4838,16 @@
                 <w:rFonts w:ascii="微软雅黑" w:eastAsia="微软雅黑" w:hAnsi="微软雅黑" w:cs="微软雅黑" w:hint="eastAsia"/>
                 <w:b/>
                 <w:bCs/>
-                <w:spacing w:val="4"/>
-                <w:sz w:val="18"/>
-                <w:szCs w:val="18"/>
-              </w:rPr>
-            </w:pPr>
-            <w:r>
-              <w:rPr>
-                <w:rFonts w:ascii="微软雅黑" w:eastAsia="微软雅黑" w:hAnsi="微软雅黑" w:hint="eastAsia"/>
+                <w:color w:val="4C94D8" w:themeColor="text2" w:themeTint="80"/>
+                <w:spacing w:val="4"/>
+                <w:sz w:val="18"/>
+                <w:szCs w:val="18"/>
+              </w:rPr>
+            </w:pPr>
+            <w:r>
+              <w:rPr>
+                <w:rFonts w:ascii="微软雅黑" w:eastAsia="微软雅黑" w:hAnsi="微软雅黑" w:hint="eastAsia"/>
+                <w:color w:val="4C94D8" w:themeColor="text2" w:themeTint="80"/>
                 <w:spacing w:val="2"/>
                 <w:sz w:val="13"/>
                 <w:szCs w:val="13"/>
@@ -4823,6 +4858,7 @@
             <w:r>
               <w:rPr>
                 <w:rFonts w:ascii="微软雅黑" w:eastAsia="微软雅黑" w:hAnsi="微软雅黑" w:hint="eastAsia"/>
+                <w:color w:val="4C94D8" w:themeColor="text2" w:themeTint="80"/>
                 <w:spacing w:val="2"/>
                 <w:sz w:val="13"/>
                 <w:szCs w:val="13"/>
@@ -4833,6 +4869,7 @@
             <w:r>
               <w:rPr>
                 <w:rFonts w:ascii="微软雅黑" w:eastAsia="微软雅黑" w:hAnsi="微软雅黑" w:hint="eastAsia"/>
+                <w:color w:val="4C94D8" w:themeColor="text2" w:themeTint="80"/>
                 <w:spacing w:val="2"/>
                 <w:sz w:val="13"/>
                 <w:szCs w:val="13"/>
@@ -4843,6 +4880,7 @@
             <w:r>
               <w:rPr>
                 <w:rFonts w:ascii="微软雅黑" w:eastAsia="微软雅黑" w:hAnsi="微软雅黑" w:hint="eastAsia"/>
+                <w:color w:val="4C94D8" w:themeColor="text2" w:themeTint="80"/>
                 <w:spacing w:val="2"/>
                 <w:sz w:val="13"/>
                 <w:szCs w:val="13"/>
@@ -4853,6 +4891,7 @@
             <w:r>
               <w:rPr>
                 <w:rFonts w:ascii="微软雅黑" w:eastAsia="微软雅黑" w:hAnsi="微软雅黑" w:hint="eastAsia"/>
+                <w:color w:val="4C94D8" w:themeColor="text2" w:themeTint="80"/>
                 <w:spacing w:val="2"/>
                 <w:sz w:val="13"/>
                 <w:szCs w:val="13"/>
@@ -4900,6 +4939,7 @@
               <w:spacing w:after="0" w:line="240" w:lineRule="auto"/>
               <w:rPr>
                 <w:rFonts w:ascii="微软雅黑" w:eastAsia="微软雅黑" w:hAnsi="微软雅黑" w:hint="eastAsia"/>
+                <w:color w:val="4C94D8" w:themeColor="text2" w:themeTint="80"/>
                 <w:spacing w:val="2"/>
                 <w:sz w:val="13"/>
                 <w:szCs w:val="13"/>
@@ -4908,6 +4948,7 @@
             <w:r>
               <w:rPr>
                 <w:rFonts w:ascii="微软雅黑" w:eastAsia="微软雅黑" w:hAnsi="微软雅黑" w:hint="eastAsia"/>
+                <w:color w:val="4C94D8" w:themeColor="text2" w:themeTint="80"/>
                 <w:spacing w:val="2"/>
                 <w:sz w:val="13"/>
                 <w:szCs w:val="13"/>
@@ -4918,6 +4959,7 @@
             <w:r>
               <w:rPr>
                 <w:rFonts w:ascii="微软雅黑" w:eastAsia="微软雅黑" w:hAnsi="微软雅黑" w:hint="eastAsia"/>
+                <w:color w:val="4C94D8" w:themeColor="text2" w:themeTint="80"/>
                 <w:spacing w:val="2"/>
                 <w:sz w:val="13"/>
                 <w:szCs w:val="13"/>
@@ -4928,6 +4970,7 @@
             <w:r>
               <w:rPr>
                 <w:rFonts w:ascii="微软雅黑" w:eastAsia="微软雅黑" w:hAnsi="微软雅黑" w:hint="eastAsia"/>
+                <w:color w:val="4C94D8" w:themeColor="text2" w:themeTint="80"/>
                 <w:spacing w:val="2"/>
                 <w:sz w:val="13"/>
                 <w:szCs w:val="13"/>
@@ -4942,14 +4985,16 @@
                 <w:rFonts w:ascii="微软雅黑" w:eastAsia="微软雅黑" w:hAnsi="微软雅黑" w:cs="微软雅黑" w:hint="eastAsia"/>
                 <w:b/>
                 <w:bCs/>
-                <w:spacing w:val="4"/>
-                <w:sz w:val="18"/>
-                <w:szCs w:val="18"/>
-              </w:rPr>
-            </w:pPr>
-            <w:r>
-              <w:rPr>
-                <w:rFonts w:ascii="微软雅黑" w:eastAsia="微软雅黑" w:hAnsi="微软雅黑" w:hint="eastAsia"/>
+                <w:color w:val="4C94D8" w:themeColor="text2" w:themeTint="80"/>
+                <w:spacing w:val="4"/>
+                <w:sz w:val="18"/>
+                <w:szCs w:val="18"/>
+              </w:rPr>
+            </w:pPr>
+            <w:r>
+              <w:rPr>
+                <w:rFonts w:ascii="微软雅黑" w:eastAsia="微软雅黑" w:hAnsi="微软雅黑" w:hint="eastAsia"/>
+                <w:color w:val="4C94D8" w:themeColor="text2" w:themeTint="80"/>
                 <w:spacing w:val="2"/>
                 <w:sz w:val="13"/>
                 <w:szCs w:val="13"/>
@@ -4968,6 +5013,7 @@
               <w:spacing w:after="0" w:line="240" w:lineRule="auto"/>
               <w:rPr>
                 <w:rFonts w:ascii="微软雅黑" w:eastAsia="微软雅黑" w:hAnsi="微软雅黑" w:hint="eastAsia"/>
+                <w:color w:val="4C94D8" w:themeColor="text2" w:themeTint="80"/>
                 <w:spacing w:val="2"/>
                 <w:sz w:val="13"/>
                 <w:szCs w:val="13"/>
@@ -4976,6 +5022,7 @@
             <w:r>
               <w:rPr>
                 <w:rFonts w:ascii="微软雅黑" w:eastAsia="微软雅黑" w:hAnsi="微软雅黑" w:hint="eastAsia"/>
+                <w:color w:val="4C94D8" w:themeColor="text2" w:themeTint="80"/>
                 <w:spacing w:val="2"/>
                 <w:sz w:val="13"/>
                 <w:szCs w:val="13"/>
@@ -4990,14 +5037,16 @@
                 <w:rFonts w:ascii="微软雅黑" w:eastAsia="微软雅黑" w:hAnsi="微软雅黑" w:cs="微软雅黑" w:hint="eastAsia"/>
                 <w:b/>
                 <w:bCs/>
-                <w:spacing w:val="4"/>
-                <w:sz w:val="18"/>
-                <w:szCs w:val="18"/>
-              </w:rPr>
-            </w:pPr>
-            <w:r>
-              <w:rPr>
-                <w:rFonts w:ascii="微软雅黑" w:eastAsia="微软雅黑" w:hAnsi="微软雅黑" w:hint="eastAsia"/>
+                <w:color w:val="4C94D8" w:themeColor="text2" w:themeTint="80"/>
+                <w:spacing w:val="4"/>
+                <w:sz w:val="18"/>
+                <w:szCs w:val="18"/>
+              </w:rPr>
+            </w:pPr>
+            <w:r>
+              <w:rPr>
+                <w:rFonts w:ascii="微软雅黑" w:eastAsia="微软雅黑" w:hAnsi="微软雅黑" w:hint="eastAsia"/>
+                <w:color w:val="4C94D8" w:themeColor="text2" w:themeTint="80"/>
                 <w:spacing w:val="2"/>
                 <w:sz w:val="13"/>
                 <w:szCs w:val="13"/>
@@ -5045,6 +5094,7 @@
               <w:spacing w:after="0" w:line="240" w:lineRule="auto"/>
               <w:rPr>
                 <w:rFonts w:ascii="微软雅黑" w:eastAsia="微软雅黑" w:hAnsi="微软雅黑" w:hint="eastAsia"/>
+                <w:color w:val="4C94D8" w:themeColor="text2" w:themeTint="80"/>
                 <w:spacing w:val="2"/>
                 <w:sz w:val="13"/>
                 <w:szCs w:val="13"/>
@@ -5053,6 +5103,7 @@
             <w:r>
               <w:rPr>
                 <w:rFonts w:ascii="微软雅黑" w:eastAsia="微软雅黑" w:hAnsi="微软雅黑" w:hint="eastAsia"/>
+                <w:color w:val="4C94D8" w:themeColor="text2" w:themeTint="80"/>
                 <w:spacing w:val="2"/>
                 <w:sz w:val="13"/>
                 <w:szCs w:val="13"/>
@@ -5067,14 +5118,16 @@
                 <w:rFonts w:ascii="微软雅黑" w:eastAsia="微软雅黑" w:hAnsi="微软雅黑" w:cs="微软雅黑" w:hint="eastAsia"/>
                 <w:b/>
                 <w:bCs/>
-                <w:spacing w:val="4"/>
-                <w:sz w:val="18"/>
-                <w:szCs w:val="18"/>
-              </w:rPr>
-            </w:pPr>
-            <w:r>
-              <w:rPr>
-                <w:rFonts w:ascii="微软雅黑" w:eastAsia="微软雅黑" w:hAnsi="微软雅黑" w:hint="eastAsia"/>
+                <w:color w:val="4C94D8" w:themeColor="text2" w:themeTint="80"/>
+                <w:spacing w:val="4"/>
+                <w:sz w:val="18"/>
+                <w:szCs w:val="18"/>
+              </w:rPr>
+            </w:pPr>
+            <w:r>
+              <w:rPr>
+                <w:rFonts w:ascii="微软雅黑" w:eastAsia="微软雅黑" w:hAnsi="微软雅黑" w:hint="eastAsia"/>
+                <w:color w:val="4C94D8" w:themeColor="text2" w:themeTint="80"/>
                 <w:spacing w:val="2"/>
                 <w:sz w:val="13"/>
                 <w:szCs w:val="13"/>
@@ -5093,6 +5146,7 @@
               <w:spacing w:after="0" w:line="240" w:lineRule="auto"/>
               <w:rPr>
                 <w:rFonts w:ascii="微软雅黑" w:eastAsia="微软雅黑" w:hAnsi="微软雅黑" w:hint="eastAsia"/>
+                <w:color w:val="4C94D8" w:themeColor="text2" w:themeTint="80"/>
                 <w:spacing w:val="2"/>
                 <w:sz w:val="13"/>
                 <w:szCs w:val="13"/>
@@ -5101,6 +5155,7 @@
             <w:r>
               <w:rPr>
                 <w:rFonts w:ascii="微软雅黑" w:eastAsia="微软雅黑" w:hAnsi="微软雅黑" w:hint="eastAsia"/>
+                <w:color w:val="4C94D8" w:themeColor="text2" w:themeTint="80"/>
                 <w:spacing w:val="2"/>
                 <w:sz w:val="13"/>
                 <w:szCs w:val="13"/>
@@ -5111,6 +5166,7 @@
             <w:r>
               <w:rPr>
                 <w:rFonts w:ascii="微软雅黑" w:eastAsia="微软雅黑" w:hAnsi="微软雅黑" w:hint="eastAsia"/>
+                <w:color w:val="4C94D8" w:themeColor="text2" w:themeTint="80"/>
                 <w:spacing w:val="2"/>
                 <w:sz w:val="13"/>
                 <w:szCs w:val="13"/>
@@ -5121,6 +5177,7 @@
             <w:r>
               <w:rPr>
                 <w:rFonts w:ascii="微软雅黑" w:eastAsia="微软雅黑" w:hAnsi="微软雅黑" w:hint="eastAsia"/>
+                <w:color w:val="4C94D8" w:themeColor="text2" w:themeTint="80"/>
                 <w:spacing w:val="2"/>
                 <w:sz w:val="13"/>
                 <w:szCs w:val="13"/>
@@ -5135,14 +5192,16 @@
                 <w:rFonts w:ascii="微软雅黑" w:eastAsia="微软雅黑" w:hAnsi="微软雅黑" w:cs="微软雅黑" w:hint="eastAsia"/>
                 <w:b/>
                 <w:bCs/>
-                <w:spacing w:val="4"/>
-                <w:sz w:val="18"/>
-                <w:szCs w:val="18"/>
-              </w:rPr>
-            </w:pPr>
-            <w:r>
-              <w:rPr>
-                <w:rFonts w:ascii="微软雅黑" w:eastAsia="微软雅黑" w:hAnsi="微软雅黑" w:hint="eastAsia"/>
+                <w:color w:val="4C94D8" w:themeColor="text2" w:themeTint="80"/>
+                <w:spacing w:val="4"/>
+                <w:sz w:val="18"/>
+                <w:szCs w:val="18"/>
+              </w:rPr>
+            </w:pPr>
+            <w:r>
+              <w:rPr>
+                <w:rFonts w:ascii="微软雅黑" w:eastAsia="微软雅黑" w:hAnsi="微软雅黑" w:hint="eastAsia"/>
+                <w:color w:val="4C94D8" w:themeColor="text2" w:themeTint="80"/>
                 <w:spacing w:val="2"/>
                 <w:sz w:val="13"/>
                 <w:szCs w:val="13"/>
@@ -5190,6 +5249,7 @@
               <w:spacing w:after="0" w:line="240" w:lineRule="auto"/>
               <w:rPr>
                 <w:rFonts w:ascii="微软雅黑" w:eastAsia="微软雅黑" w:hAnsi="微软雅黑" w:cs="微软雅黑" w:hint="eastAsia"/>
+                <w:color w:val="4C94D8" w:themeColor="text2" w:themeTint="80"/>
                 <w:spacing w:val="4"/>
                 <w:sz w:val="13"/>
                 <w:szCs w:val="13"/>
@@ -5198,6 +5258,7 @@
             <w:r>
               <w:rPr>
                 <w:rFonts w:ascii="微软雅黑" w:eastAsia="微软雅黑" w:hAnsi="微软雅黑" w:cs="微软雅黑" w:hint="eastAsia"/>
+                <w:color w:val="4C94D8" w:themeColor="text2" w:themeTint="80"/>
                 <w:spacing w:val="4"/>
                 <w:sz w:val="13"/>
                 <w:szCs w:val="13"/>
@@ -5212,6 +5273,7 @@
                 <w:rFonts w:ascii="微软雅黑" w:eastAsia="微软雅黑" w:hAnsi="微软雅黑" w:cs="微软雅黑" w:hint="eastAsia"/>
                 <w:b/>
                 <w:bCs/>
+                <w:color w:val="4C94D8" w:themeColor="text2" w:themeTint="80"/>
                 <w:spacing w:val="4"/>
                 <w:sz w:val="18"/>
                 <w:szCs w:val="18"/>
@@ -5220,6 +5282,7 @@
             <w:r>
               <w:rPr>
                 <w:rFonts w:ascii="微软雅黑" w:eastAsia="微软雅黑" w:hAnsi="微软雅黑" w:cs="微软雅黑" w:hint="eastAsia"/>
+                <w:color w:val="4C94D8" w:themeColor="text2" w:themeTint="80"/>
                 <w:spacing w:val="4"/>
                 <w:sz w:val="13"/>
                 <w:szCs w:val="13"/>
@@ -5238,6 +5301,7 @@
               <w:spacing w:after="0" w:line="240" w:lineRule="auto"/>
               <w:rPr>
                 <w:rFonts w:ascii="微软雅黑" w:eastAsia="微软雅黑" w:hAnsi="微软雅黑" w:hint="eastAsia"/>
+                <w:color w:val="4C94D8" w:themeColor="text2" w:themeTint="80"/>
                 <w:spacing w:val="2"/>
                 <w:sz w:val="13"/>
                 <w:szCs w:val="13"/>
@@ -5246,6 +5310,7 @@
             <w:r>
               <w:rPr>
                 <w:rFonts w:ascii="微软雅黑" w:eastAsia="微软雅黑" w:hAnsi="微软雅黑" w:hint="eastAsia"/>
+                <w:color w:val="4C94D8" w:themeColor="text2" w:themeTint="80"/>
                 <w:spacing w:val="2"/>
                 <w:sz w:val="13"/>
                 <w:szCs w:val="13"/>
@@ -5256,6 +5321,7 @@
             <w:r>
               <w:rPr>
                 <w:rFonts w:ascii="微软雅黑" w:eastAsia="微软雅黑" w:hAnsi="微软雅黑" w:hint="eastAsia"/>
+                <w:color w:val="4C94D8" w:themeColor="text2" w:themeTint="80"/>
                 <w:spacing w:val="2"/>
                 <w:sz w:val="13"/>
                 <w:szCs w:val="13"/>
@@ -5266,6 +5332,7 @@
             <w:r>
               <w:rPr>
                 <w:rFonts w:ascii="微软雅黑" w:eastAsia="微软雅黑" w:hAnsi="微软雅黑" w:hint="eastAsia"/>
+                <w:color w:val="4C94D8" w:themeColor="text2" w:themeTint="80"/>
                 <w:spacing w:val="2"/>
                 <w:sz w:val="13"/>
                 <w:szCs w:val="13"/>
@@ -5280,14 +5347,16 @@
                 <w:rFonts w:ascii="微软雅黑" w:eastAsia="微软雅黑" w:hAnsi="微软雅黑" w:cs="微软雅黑" w:hint="eastAsia"/>
                 <w:b/>
                 <w:bCs/>
-                <w:spacing w:val="4"/>
-                <w:sz w:val="18"/>
-                <w:szCs w:val="18"/>
-              </w:rPr>
-            </w:pPr>
-            <w:r>
-              <w:rPr>
-                <w:rFonts w:ascii="微软雅黑" w:eastAsia="微软雅黑" w:hAnsi="微软雅黑" w:hint="eastAsia"/>
+                <w:color w:val="4C94D8" w:themeColor="text2" w:themeTint="80"/>
+                <w:spacing w:val="4"/>
+                <w:sz w:val="18"/>
+                <w:szCs w:val="18"/>
+              </w:rPr>
+            </w:pPr>
+            <w:r>
+              <w:rPr>
+                <w:rFonts w:ascii="微软雅黑" w:eastAsia="微软雅黑" w:hAnsi="微软雅黑" w:hint="eastAsia"/>
+                <w:color w:val="4C94D8" w:themeColor="text2" w:themeTint="80"/>
                 <w:spacing w:val="2"/>
                 <w:sz w:val="13"/>
                 <w:szCs w:val="13"/>
@@ -5303,19 +5372,23 @@
         <w:spacing w:after="0" w:line="240" w:lineRule="auto"/>
         <w:rPr>
           <w:rFonts w:ascii="微软雅黑" w:eastAsia="微软雅黑" w:hAnsi="微软雅黑" w:hint="eastAsia"/>
+          <w:sz w:val="18"/>
+          <w:szCs w:val="18"/>
         </w:rPr>
       </w:pPr>
     </w:p>
     <w:p>
       <w:pPr>
         <w:pStyle w:val="2"/>
+        <w:rPr>
+          <w:rFonts w:hint="eastAsia"/>
+        </w:rPr>
       </w:pPr>
       <w:bookmarkStart w:id="8" w:name="_Toc235027612"/>
       <w:r>
         <w:rPr>
           <w:rFonts w:hint="eastAsia"/>
         </w:rPr>
-        <w:lastRenderedPageBreak/>
         <w:t>8. 安全策略及措施</w:t>
       </w:r>
       <w:bookmarkEnd w:id="8"/>
@@ -5324,7 +5397,8 @@
       <w:pPr>
         <w:spacing w:after="0" w:line="240" w:lineRule="auto"/>
         <w:rPr>
-          <w:rFonts w:ascii="微软雅黑" w:eastAsia="微软雅黑" w:hAnsi="微软雅黑" w:hint="eastAsia"/>
+          <w:rFonts w:ascii="微软雅黑" w:eastAsia="微软雅黑" w:hAnsi="微软雅黑"/>
+          <w:color w:val="4C94D8" w:themeColor="text2" w:themeTint="80"/>
           <w:sz w:val="18"/>
           <w:szCs w:val="18"/>
         </w:rPr>
@@ -5332,6 +5406,7 @@
       <w:r>
         <w:rPr>
           <w:rFonts w:ascii="微软雅黑" w:eastAsia="微软雅黑" w:hAnsi="微软雅黑" w:hint="eastAsia"/>
+          <w:color w:val="4C94D8" w:themeColor="text2" w:themeTint="80"/>
           <w:sz w:val="18"/>
           <w:szCs w:val="18"/>
         </w:rPr>
@@ -5340,7 +5415,62 @@
     </w:p>
     <w:p>
       <w:pPr>
+        <w:spacing w:after="0" w:line="240" w:lineRule="auto"/>
+        <w:rPr>
+          <w:rFonts w:ascii="微软雅黑" w:eastAsia="微软雅黑" w:hAnsi="微软雅黑"/>
+          <w:color w:val="4C94D8" w:themeColor="text2" w:themeTint="80"/>
+          <w:sz w:val="18"/>
+          <w:szCs w:val="18"/>
+        </w:rPr>
+      </w:pPr>
+      <w:r>
+        <w:rPr>
+          <w:rFonts w:ascii="微软雅黑" w:eastAsia="微软雅黑" w:hAnsi="微软雅黑" w:hint="eastAsia"/>
+          <w:color w:val="4C94D8" w:themeColor="text2" w:themeTint="80"/>
+          <w:sz w:val="18"/>
+          <w:szCs w:val="18"/>
+        </w:rPr>
+        <w:t>或</w:t>
+      </w:r>
+    </w:p>
+    <w:p>
+      <w:pPr>
+        <w:spacing w:after="0" w:line="240" w:lineRule="auto"/>
+        <w:rPr>
+          <w:rFonts w:ascii="微软雅黑" w:eastAsia="微软雅黑" w:hAnsi="微软雅黑"/>
+          <w:color w:val="4C94D8" w:themeColor="text2" w:themeTint="80"/>
+          <w:sz w:val="18"/>
+          <w:szCs w:val="18"/>
+        </w:rPr>
+      </w:pPr>
+      <w:r>
+        <w:rPr>
+          <w:rFonts w:ascii="微软雅黑" w:eastAsia="微软雅黑" w:hAnsi="微软雅黑" w:hint="eastAsia"/>
+          <w:color w:val="4C94D8" w:themeColor="text2" w:themeTint="80"/>
+          <w:sz w:val="18"/>
+          <w:szCs w:val="18"/>
+        </w:rPr>
+        <w:lastRenderedPageBreak/>
+        <w:t>不涉及</w:t>
+      </w:r>
+    </w:p>
+    <w:p>
+      <w:pPr>
+        <w:spacing w:after="0" w:line="240" w:lineRule="auto"/>
+        <w:rPr>
+          <w:rFonts w:ascii="微软雅黑" w:eastAsia="微软雅黑" w:hAnsi="微软雅黑" w:hint="eastAsia"/>
+          <w:color w:val="4C94D8" w:themeColor="text2" w:themeTint="80"/>
+          <w:sz w:val="18"/>
+          <w:szCs w:val="18"/>
+        </w:rPr>
+      </w:pPr>
+    </w:p>
+    <w:p>
+      <w:pPr>
         <w:pStyle w:val="2"/>
+        <w:rPr>
+          <w:rFonts w:hint="eastAsia"/>
+        </w:rPr>
       </w:pPr>
       <w:bookmarkStart w:id="9" w:name="_Toc235027613"/>
       <w:r>
@@ -5356,6 +5486,7 @@
         <w:spacing w:after="0" w:line="240" w:lineRule="auto"/>
         <w:rPr>
           <w:rFonts w:ascii="微软雅黑" w:eastAsia="微软雅黑" w:hAnsi="微软雅黑" w:hint="eastAsia"/>
+          <w:color w:val="4C94D8" w:themeColor="text2" w:themeTint="80"/>
           <w:sz w:val="18"/>
           <w:szCs w:val="18"/>
         </w:rPr>
@@ -5363,6 +5494,7 @@
       <w:r>
         <w:rPr>
           <w:rFonts w:ascii="微软雅黑" w:eastAsia="微软雅黑" w:hAnsi="微软雅黑" w:hint="eastAsia"/>
+          <w:color w:val="4C94D8" w:themeColor="text2" w:themeTint="80"/>
           <w:sz w:val="18"/>
           <w:szCs w:val="18"/>
         </w:rPr>
@@ -5374,6 +5506,7 @@
         <w:spacing w:after="0" w:line="240" w:lineRule="auto"/>
         <w:rPr>
           <w:rFonts w:ascii="微软雅黑" w:eastAsia="微软雅黑" w:hAnsi="微软雅黑" w:hint="eastAsia"/>
+          <w:color w:val="4C94D8" w:themeColor="text2" w:themeTint="80"/>
           <w:sz w:val="18"/>
           <w:szCs w:val="18"/>
         </w:rPr>
@@ -5381,6 +5514,7 @@
       <w:r>
         <w:rPr>
           <w:rFonts w:ascii="微软雅黑" w:eastAsia="微软雅黑" w:hAnsi="微软雅黑" w:hint="eastAsia"/>
+          <w:color w:val="4C94D8" w:themeColor="text2" w:themeTint="80"/>
           <w:sz w:val="18"/>
           <w:szCs w:val="18"/>
         </w:rPr>
@@ -5392,6 +5526,7 @@
         <w:spacing w:after="0" w:line="240" w:lineRule="auto"/>
         <w:rPr>
           <w:rFonts w:ascii="微软雅黑" w:eastAsia="微软雅黑" w:hAnsi="微软雅黑" w:hint="eastAsia"/>
+          <w:color w:val="4C94D8" w:themeColor="text2" w:themeTint="80"/>
           <w:sz w:val="18"/>
           <w:szCs w:val="18"/>
         </w:rPr>
@@ -5399,6 +5534,7 @@
       <w:r>
         <w:rPr>
           <w:rFonts w:ascii="微软雅黑" w:eastAsia="微软雅黑" w:hAnsi="微软雅黑" w:hint="eastAsia"/>
+          <w:color w:val="4C94D8" w:themeColor="text2" w:themeTint="80"/>
           <w:sz w:val="18"/>
           <w:szCs w:val="18"/>
         </w:rPr>
@@ -5408,6 +5544,7 @@
       <w:r>
         <w:rPr>
           <w:rFonts w:ascii="微软雅黑" w:eastAsia="微软雅黑" w:hAnsi="微软雅黑" w:hint="eastAsia"/>
+          <w:color w:val="4C94D8" w:themeColor="text2" w:themeTint="80"/>
           <w:sz w:val="18"/>
           <w:szCs w:val="18"/>
         </w:rPr>
@@ -5417,6 +5554,7 @@
       <w:r>
         <w:rPr>
           <w:rFonts w:ascii="微软雅黑" w:eastAsia="微软雅黑" w:hAnsi="微软雅黑" w:hint="eastAsia"/>
+          <w:color w:val="4C94D8" w:themeColor="text2" w:themeTint="80"/>
           <w:sz w:val="18"/>
           <w:szCs w:val="18"/>
         </w:rPr>
@@ -5428,6 +5566,7 @@
         <w:spacing w:after="0" w:line="240" w:lineRule="auto"/>
         <w:rPr>
           <w:rFonts w:ascii="微软雅黑" w:eastAsia="微软雅黑" w:hAnsi="微软雅黑" w:hint="eastAsia"/>
+          <w:color w:val="4C94D8" w:themeColor="text2" w:themeTint="80"/>
           <w:sz w:val="18"/>
           <w:szCs w:val="18"/>
         </w:rPr>
@@ -5435,6 +5574,7 @@
       <w:r>
         <w:rPr>
           <w:rFonts w:ascii="微软雅黑" w:eastAsia="微软雅黑" w:hAnsi="微软雅黑" w:hint="eastAsia"/>
+          <w:color w:val="4C94D8" w:themeColor="text2" w:themeTint="80"/>
           <w:sz w:val="18"/>
           <w:szCs w:val="18"/>
         </w:rPr>
@@ -5444,6 +5584,7 @@
       <w:r>
         <w:rPr>
           <w:rFonts w:ascii="微软雅黑" w:eastAsia="微软雅黑" w:hAnsi="微软雅黑" w:hint="eastAsia"/>
+          <w:color w:val="4C94D8" w:themeColor="text2" w:themeTint="80"/>
           <w:sz w:val="18"/>
           <w:szCs w:val="18"/>
         </w:rPr>
@@ -5453,6 +5594,7 @@
       <w:r>
         <w:rPr>
           <w:rFonts w:ascii="微软雅黑" w:eastAsia="微软雅黑" w:hAnsi="微软雅黑" w:hint="eastAsia"/>
+          <w:color w:val="4C94D8" w:themeColor="text2" w:themeTint="80"/>
           <w:sz w:val="18"/>
           <w:szCs w:val="18"/>
         </w:rPr>
@@ -5464,6 +5606,7 @@
         <w:spacing w:after="0" w:line="240" w:lineRule="auto"/>
         <w:rPr>
           <w:rFonts w:ascii="微软雅黑" w:eastAsia="微软雅黑" w:hAnsi="微软雅黑" w:hint="eastAsia"/>
+          <w:color w:val="4C94D8" w:themeColor="text2" w:themeTint="80"/>
           <w:sz w:val="18"/>
           <w:szCs w:val="18"/>
         </w:rPr>
@@ -5471,6 +5614,7 @@
       <w:r>
         <w:rPr>
           <w:rFonts w:ascii="微软雅黑" w:eastAsia="微软雅黑" w:hAnsi="微软雅黑" w:hint="eastAsia"/>
+          <w:color w:val="4C94D8" w:themeColor="text2" w:themeTint="80"/>
           <w:sz w:val="18"/>
           <w:szCs w:val="18"/>
         </w:rPr>
@@ -5482,6 +5626,7 @@
         <w:spacing w:after="0" w:line="240" w:lineRule="auto"/>
         <w:rPr>
           <w:rFonts w:ascii="微软雅黑" w:eastAsia="微软雅黑" w:hAnsi="微软雅黑" w:hint="eastAsia"/>
+          <w:color w:val="4C94D8" w:themeColor="text2" w:themeTint="80"/>
           <w:sz w:val="18"/>
           <w:szCs w:val="18"/>
         </w:rPr>
@@ -5489,6 +5634,7 @@
       <w:r>
         <w:rPr>
           <w:rFonts w:ascii="微软雅黑" w:eastAsia="微软雅黑" w:hAnsi="微软雅黑" w:hint="eastAsia"/>
+          <w:color w:val="4C94D8" w:themeColor="text2" w:themeTint="80"/>
           <w:sz w:val="18"/>
           <w:szCs w:val="18"/>
         </w:rPr>
@@ -5498,6 +5644,7 @@
       <w:r>
         <w:rPr>
           <w:rFonts w:ascii="微软雅黑" w:eastAsia="微软雅黑" w:hAnsi="微软雅黑" w:hint="eastAsia"/>
+          <w:color w:val="4C94D8" w:themeColor="text2" w:themeTint="80"/>
           <w:sz w:val="18"/>
           <w:szCs w:val="18"/>
         </w:rPr>
@@ -5507,6 +5654,7 @@
       <w:r>
         <w:rPr>
           <w:rFonts w:ascii="微软雅黑" w:eastAsia="微软雅黑" w:hAnsi="微软雅黑" w:hint="eastAsia"/>
+          <w:color w:val="4C94D8" w:themeColor="text2" w:themeTint="80"/>
           <w:sz w:val="18"/>
           <w:szCs w:val="18"/>
         </w:rPr>
@@ -5518,6 +5666,7 @@
         <w:spacing w:after="0" w:line="240" w:lineRule="auto"/>
         <w:rPr>
           <w:rFonts w:ascii="微软雅黑" w:eastAsia="微软雅黑" w:hAnsi="微软雅黑" w:hint="eastAsia"/>
+          <w:color w:val="4C94D8" w:themeColor="text2" w:themeTint="80"/>
           <w:sz w:val="18"/>
           <w:szCs w:val="18"/>
         </w:rPr>
@@ -5525,6 +5674,7 @@
       <w:r>
         <w:rPr>
           <w:rFonts w:ascii="微软雅黑" w:eastAsia="微软雅黑" w:hAnsi="微软雅黑" w:hint="eastAsia"/>
+          <w:color w:val="4C94D8" w:themeColor="text2" w:themeTint="80"/>
           <w:sz w:val="18"/>
           <w:szCs w:val="18"/>
         </w:rPr>
@@ -5536,6 +5686,7 @@
         <w:spacing w:after="0" w:line="240" w:lineRule="auto"/>
         <w:rPr>
           <w:rFonts w:ascii="微软雅黑" w:eastAsia="微软雅黑" w:hAnsi="微软雅黑" w:hint="eastAsia"/>
+          <w:color w:val="4C94D8" w:themeColor="text2" w:themeTint="80"/>
           <w:sz w:val="18"/>
           <w:szCs w:val="18"/>
         </w:rPr>
@@ -5543,6 +5694,7 @@
       <w:r>
         <w:rPr>
           <w:rFonts w:ascii="微软雅黑" w:eastAsia="微软雅黑" w:hAnsi="微软雅黑" w:hint="eastAsia"/>
+          <w:color w:val="4C94D8" w:themeColor="text2" w:themeTint="80"/>
           <w:sz w:val="18"/>
           <w:szCs w:val="18"/>
         </w:rPr>
@@ -5554,6 +5706,7 @@
         <w:spacing w:after="0" w:line="240" w:lineRule="auto"/>
         <w:rPr>
           <w:rFonts w:ascii="微软雅黑" w:eastAsia="微软雅黑" w:hAnsi="微软雅黑" w:hint="eastAsia"/>
+          <w:color w:val="4C94D8" w:themeColor="text2" w:themeTint="80"/>
           <w:sz w:val="18"/>
           <w:szCs w:val="18"/>
         </w:rPr>
@@ -5561,6 +5714,7 @@
       <w:r>
         <w:rPr>
           <w:rFonts w:ascii="微软雅黑" w:eastAsia="微软雅黑" w:hAnsi="微软雅黑" w:hint="eastAsia"/>
+          <w:color w:val="4C94D8" w:themeColor="text2" w:themeTint="80"/>
           <w:sz w:val="18"/>
           <w:szCs w:val="18"/>
         </w:rPr>
@@ -5572,6 +5726,7 @@
         <w:spacing w:after="0" w:line="240" w:lineRule="auto"/>
         <w:rPr>
           <w:rFonts w:ascii="微软雅黑" w:eastAsia="微软雅黑" w:hAnsi="微软雅黑" w:hint="eastAsia"/>
+          <w:color w:val="4C94D8" w:themeColor="text2" w:themeTint="80"/>
           <w:sz w:val="18"/>
           <w:szCs w:val="18"/>
         </w:rPr>
@@ -5579,6 +5734,7 @@
       <w:r>
         <w:rPr>
           <w:rFonts w:ascii="微软雅黑" w:eastAsia="微软雅黑" w:hAnsi="微软雅黑" w:hint="eastAsia"/>
+          <w:color w:val="4C94D8" w:themeColor="text2" w:themeTint="80"/>
           <w:sz w:val="18"/>
           <w:szCs w:val="18"/>
         </w:rPr>
@@ -5590,6 +5746,7 @@
         <w:spacing w:after="0" w:line="240" w:lineRule="auto"/>
         <w:rPr>
           <w:rFonts w:ascii="微软雅黑" w:eastAsia="微软雅黑" w:hAnsi="微软雅黑" w:hint="eastAsia"/>
+          <w:color w:val="4C94D8" w:themeColor="text2" w:themeTint="80"/>
           <w:sz w:val="18"/>
           <w:szCs w:val="18"/>
         </w:rPr>
@@ -5597,6 +5754,7 @@
       <w:r>
         <w:rPr>
           <w:rFonts w:ascii="微软雅黑" w:eastAsia="微软雅黑" w:hAnsi="微软雅黑" w:hint="eastAsia"/>
+          <w:color w:val="4C94D8" w:themeColor="text2" w:themeTint="80"/>
           <w:sz w:val="18"/>
           <w:szCs w:val="18"/>
         </w:rPr>
@@ -5606,6 +5764,7 @@
       <w:r>
         <w:rPr>
           <w:rFonts w:ascii="微软雅黑" w:eastAsia="微软雅黑" w:hAnsi="微软雅黑" w:hint="eastAsia"/>
+          <w:color w:val="4C94D8" w:themeColor="text2" w:themeTint="80"/>
           <w:sz w:val="18"/>
           <w:szCs w:val="18"/>
         </w:rPr>
@@ -5615,6 +5774,7 @@
       <w:r>
         <w:rPr>
           <w:rFonts w:ascii="微软雅黑" w:eastAsia="微软雅黑" w:hAnsi="微软雅黑" w:hint="eastAsia"/>
+          <w:color w:val="4C94D8" w:themeColor="text2" w:themeTint="80"/>
           <w:sz w:val="18"/>
           <w:szCs w:val="18"/>
         </w:rPr>
@@ -5626,6 +5786,7 @@
         <w:spacing w:after="0" w:line="240" w:lineRule="auto"/>
         <w:rPr>
           <w:rFonts w:ascii="微软雅黑" w:eastAsia="微软雅黑" w:hAnsi="微软雅黑" w:hint="eastAsia"/>
+          <w:color w:val="4C94D8" w:themeColor="text2" w:themeTint="80"/>
           <w:sz w:val="18"/>
           <w:szCs w:val="18"/>
         </w:rPr>
@@ -5633,6 +5794,7 @@
       <w:r>
         <w:rPr>
           <w:rFonts w:ascii="微软雅黑" w:eastAsia="微软雅黑" w:hAnsi="微软雅黑" w:hint="eastAsia"/>
+          <w:color w:val="4C94D8" w:themeColor="text2" w:themeTint="80"/>
           <w:sz w:val="18"/>
           <w:szCs w:val="18"/>
         </w:rPr>
@@ -5642,6 +5804,7 @@
       <w:r>
         <w:rPr>
           <w:rFonts w:ascii="微软雅黑" w:eastAsia="微软雅黑" w:hAnsi="微软雅黑" w:hint="eastAsia"/>
+          <w:color w:val="4C94D8" w:themeColor="text2" w:themeTint="80"/>
           <w:sz w:val="18"/>
           <w:szCs w:val="18"/>
         </w:rPr>
@@ -5651,6 +5814,7 @@
       <w:r>
         <w:rPr>
           <w:rFonts w:ascii="微软雅黑" w:eastAsia="微软雅黑" w:hAnsi="微软雅黑" w:hint="eastAsia"/>
+          <w:color w:val="4C94D8" w:themeColor="text2" w:themeTint="80"/>
           <w:sz w:val="18"/>
           <w:szCs w:val="18"/>
         </w:rPr>
@@ -5660,6 +5824,7 @@
       <w:r>
         <w:rPr>
           <w:rFonts w:ascii="微软雅黑" w:eastAsia="微软雅黑" w:hAnsi="微软雅黑" w:hint="eastAsia"/>
+          <w:color w:val="4C94D8" w:themeColor="text2" w:themeTint="80"/>
           <w:sz w:val="18"/>
           <w:szCs w:val="18"/>
         </w:rPr>
@@ -5669,6 +5834,7 @@
       <w:r>
         <w:rPr>
           <w:rFonts w:ascii="微软雅黑" w:eastAsia="微软雅黑" w:hAnsi="微软雅黑" w:hint="eastAsia"/>
+          <w:color w:val="4C94D8" w:themeColor="text2" w:themeTint="80"/>
           <w:sz w:val="18"/>
           <w:szCs w:val="18"/>
         </w:rPr>
@@ -5678,6 +5844,7 @@
       <w:r>
         <w:rPr>
           <w:rFonts w:ascii="微软雅黑" w:eastAsia="微软雅黑" w:hAnsi="微软雅黑" w:hint="eastAsia"/>
+          <w:color w:val="4C94D8" w:themeColor="text2" w:themeTint="80"/>
           <w:sz w:val="18"/>
           <w:szCs w:val="18"/>
         </w:rPr>
@@ -5687,6 +5854,7 @@
       <w:r>
         <w:rPr>
           <w:rFonts w:ascii="微软雅黑" w:eastAsia="微软雅黑" w:hAnsi="微软雅黑" w:hint="eastAsia"/>
+          <w:color w:val="4C94D8" w:themeColor="text2" w:themeTint="80"/>
           <w:sz w:val="18"/>
           <w:szCs w:val="18"/>
         </w:rPr>
@@ -5698,6 +5866,7 @@
         <w:spacing w:after="0" w:line="240" w:lineRule="auto"/>
         <w:rPr>
           <w:rFonts w:ascii="微软雅黑" w:eastAsia="微软雅黑" w:hAnsi="微软雅黑" w:hint="eastAsia"/>
+          <w:color w:val="4C94D8" w:themeColor="text2" w:themeTint="80"/>
           <w:sz w:val="18"/>
           <w:szCs w:val="18"/>
         </w:rPr>
@@ -5705,6 +5874,7 @@
       <w:r>
         <w:rPr>
           <w:rFonts w:ascii="微软雅黑" w:eastAsia="微软雅黑" w:hAnsi="微软雅黑" w:hint="eastAsia"/>
+          <w:color w:val="4C94D8" w:themeColor="text2" w:themeTint="80"/>
           <w:sz w:val="18"/>
           <w:szCs w:val="18"/>
         </w:rPr>
@@ -5716,6 +5886,7 @@
         <w:spacing w:after="0" w:line="240" w:lineRule="auto"/>
         <w:rPr>
           <w:rFonts w:ascii="微软雅黑" w:eastAsia="微软雅黑" w:hAnsi="微软雅黑" w:hint="eastAsia"/>
+          <w:color w:val="4C94D8" w:themeColor="text2" w:themeTint="80"/>
           <w:sz w:val="18"/>
           <w:szCs w:val="18"/>
         </w:rPr>
@@ -5723,6 +5894,7 @@
       <w:r>
         <w:rPr>
           <w:rFonts w:ascii="微软雅黑" w:eastAsia="微软雅黑" w:hAnsi="微软雅黑" w:hint="eastAsia"/>
+          <w:color w:val="4C94D8" w:themeColor="text2" w:themeTint="80"/>
           <w:sz w:val="18"/>
           <w:szCs w:val="18"/>
         </w:rPr>
@@ -5734,6 +5906,7 @@
         <w:spacing w:after="0" w:line="240" w:lineRule="auto"/>
         <w:rPr>
           <w:rFonts w:ascii="微软雅黑" w:eastAsia="微软雅黑" w:hAnsi="微软雅黑" w:hint="eastAsia"/>
+          <w:color w:val="4C94D8" w:themeColor="text2" w:themeTint="80"/>
           <w:sz w:val="18"/>
           <w:szCs w:val="18"/>
         </w:rPr>
@@ -5741,6 +5914,7 @@
       <w:r>
         <w:rPr>
           <w:rFonts w:ascii="微软雅黑" w:eastAsia="微软雅黑" w:hAnsi="微软雅黑" w:hint="eastAsia"/>
+          <w:color w:val="4C94D8" w:themeColor="text2" w:themeTint="80"/>
           <w:sz w:val="18"/>
           <w:szCs w:val="18"/>
         </w:rPr>
@@ -5750,6 +5924,7 @@
       <w:r>
         <w:rPr>
           <w:rFonts w:ascii="微软雅黑" w:eastAsia="微软雅黑" w:hAnsi="微软雅黑" w:hint="eastAsia"/>
+          <w:color w:val="4C94D8" w:themeColor="text2" w:themeTint="80"/>
           <w:sz w:val="18"/>
           <w:szCs w:val="18"/>
         </w:rPr>
@@ -5759,6 +5934,7 @@
       <w:r>
         <w:rPr>
           <w:rFonts w:ascii="微软雅黑" w:eastAsia="微软雅黑" w:hAnsi="微软雅黑" w:hint="eastAsia"/>
+          <w:color w:val="4C94D8" w:themeColor="text2" w:themeTint="80"/>
           <w:sz w:val="18"/>
           <w:szCs w:val="18"/>
         </w:rPr>
@@ -5768,6 +5944,9 @@
     <w:p>
       <w:pPr>
         <w:pStyle w:val="2"/>
+        <w:rPr>
+          <w:rFonts w:hint="eastAsia"/>
+        </w:rPr>
       </w:pPr>
       <w:bookmarkStart w:id="10" w:name="_Toc235027614"/>
       <w:r>
@@ -5799,6 +5978,9 @@
     <w:p>
       <w:pPr>
         <w:pStyle w:val="2"/>
+        <w:rPr>
+          <w:rFonts w:hint="eastAsia"/>
+        </w:rPr>
       </w:pPr>
       <w:bookmarkStart w:id="11" w:name="_Toc235027615"/>
       <w:r>
@@ -5813,7 +5995,8 @@
       <w:pPr>
         <w:spacing w:after="0" w:line="240" w:lineRule="auto"/>
         <w:rPr>
-          <w:rFonts w:ascii="微软雅黑" w:eastAsia="微软雅黑" w:hAnsi="微软雅黑" w:hint="eastAsia"/>
+          <w:rFonts w:ascii="微软雅黑" w:eastAsia="微软雅黑" w:hAnsi="微软雅黑"/>
+          <w:color w:val="4C94D8" w:themeColor="text2" w:themeTint="80"/>
           <w:sz w:val="18"/>
           <w:szCs w:val="18"/>
         </w:rPr>
@@ -5821,10 +6004,51 @@
       <w:r>
         <w:rPr>
           <w:rFonts w:ascii="微软雅黑" w:eastAsia="微软雅黑" w:hAnsi="微软雅黑" w:hint="eastAsia"/>
+          <w:color w:val="4C94D8" w:themeColor="text2" w:themeTint="80"/>
           <w:sz w:val="18"/>
           <w:szCs w:val="18"/>
         </w:rPr>
         <w:t>内容包含：迁移/备份的策略、计划、流程等。</w:t>
+      </w:r>
+    </w:p>
+    <w:p>
+      <w:pPr>
+        <w:spacing w:after="0" w:line="240" w:lineRule="auto"/>
+        <w:rPr>
+          <w:rFonts w:ascii="微软雅黑" w:eastAsia="微软雅黑" w:hAnsi="微软雅黑"/>
+          <w:color w:val="4C94D8" w:themeColor="text2" w:themeTint="80"/>
+          <w:sz w:val="18"/>
+          <w:szCs w:val="18"/>
+        </w:rPr>
+      </w:pPr>
+      <w:r>
+        <w:rPr>
+          <w:rFonts w:ascii="微软雅黑" w:eastAsia="微软雅黑" w:hAnsi="微软雅黑" w:hint="eastAsia"/>
+          <w:color w:val="4C94D8" w:themeColor="text2" w:themeTint="80"/>
+          <w:sz w:val="18"/>
+          <w:szCs w:val="18"/>
+        </w:rPr>
+        <w:t>或</w:t>
+      </w:r>
+    </w:p>
+    <w:p>
+      <w:pPr>
+        <w:spacing w:after="0" w:line="240" w:lineRule="auto"/>
+        <w:rPr>
+          <w:rFonts w:ascii="微软雅黑" w:eastAsia="微软雅黑" w:hAnsi="微软雅黑" w:hint="eastAsia"/>
+          <w:color w:val="4C94D8" w:themeColor="text2" w:themeTint="80"/>
+          <w:sz w:val="18"/>
+          <w:szCs w:val="18"/>
+        </w:rPr>
+      </w:pPr>
+      <w:r>
+        <w:rPr>
+          <w:rFonts w:ascii="微软雅黑" w:eastAsia="微软雅黑" w:hAnsi="微软雅黑" w:hint="eastAsia"/>
+          <w:color w:val="4C94D8" w:themeColor="text2" w:themeTint="80"/>
+          <w:sz w:val="18"/>
+          <w:szCs w:val="18"/>
+        </w:rPr>
+        <w:t>不涉及</w:t>
       </w:r>
     </w:p>
     <w:sectPr>
@@ -5835,6 +6059,68 @@
     </w:sectPr>
   </w:body>
 </w:document>
+</file>
+
+<file path=word/endnotes.xml><?xml version="1.0" encoding="utf-8"?>
+<w:endnotes xmlns:wpc="http://schemas.microsoft.com/office/word/2010/wordprocessingCanvas" xmlns:cx="http://schemas.microsoft.com/office/drawing/2014/chartex" xmlns:cx1="http://schemas.microsoft.com/office/drawing/2015/9/8/chartex" xmlns:cx2="http://schemas.microsoft.com/office/drawing/2015/10/21/chartex" xmlns:cx3="http://schemas.microsoft.com/office/drawing/2016/5/9/chartex" xmlns:cx4="http://schemas.microsoft.com/office/drawing/2016/5/10/chartex" xmlns:cx5="http://schemas.microsoft.com/office/drawing/2016/5/11/chartex" xmlns:cx6="http://schemas.microsoft.com/office/drawing/2016/5/12/chartex" xmlns:cx7="http://schemas.microsoft.com/office/drawing/2016/5/13/chartex" xmlns:cx8="http://schemas.microsoft.com/office/drawing/2016/5/14/chartex" xmlns:mc="http://schemas.openxmlformats.org/markup-compatibility/2006" xmlns:aink="http://schemas.microsoft.com/office/drawing/2016/ink" xmlns:am3d="http://schemas.microsoft.com/office/drawing/2017/model3d" xmlns:o="urn:schemas-microsoft-com:office:office" xmlns:oel="http://schemas.microsoft.com/office/2019/extlst" xmlns:r="http://schemas.openxmlformats.org/officeDocument/2006/relationships" xmlns:m="http://schemas.openxmlformats.org/officeDocument/2006/math" xmlns:v="urn:schemas-microsoft-com:vml" xmlns:wp14="http://schemas.microsoft.com/office/word/2010/wordprocessingDrawing" xmlns:wp="http://schemas.openxmlformats.org/drawingml/2006/wordprocessingDrawing" xmlns:w10="urn:schemas-microsoft-com:office:word" xmlns:w="http://schemas.openxmlformats.org/wordprocessingml/2006/main" xmlns:w14="http://schemas.microsoft.com/office/word/2010/wordml" xmlns:w15="http://schemas.microsoft.com/office/word/2012/wordml" xmlns:w16cex="http://schemas.microsoft.com/office/word/2018/wordml/cex" xmlns:w16cid="http://schemas.microsoft.com/office/word/2016/wordml/cid" xmlns:w16="http://schemas.microsoft.com/office/word/2018/wordml" xmlns:w16sdtdh="http://schemas.microsoft.com/office/word/2020/wordml/sdtdatahash" xmlns:w16se="http://schemas.microsoft.com/office/word/2015/wordml/symex" xmlns:wpg="http://schemas.microsoft.com/office/word/2010/wordprocessingGroup" xmlns:wpi="http://schemas.microsoft.com/office/word/2010/wordprocessingInk" xmlns:wne="http://schemas.microsoft.com/office/word/2006/wordml" xmlns:wps="http://schemas.microsoft.com/office/word/2010/wordprocessingShape" mc:Ignorable="w14 w15 w16se w16cid w16 w16cex w16sdtdh wp14">
+  <w:endnote w:type="separator" w:id="-1">
+    <w:p>
+      <w:pPr>
+        <w:spacing w:after="0" w:line="240" w:lineRule="auto"/>
+        <w:rPr>
+          <w:rFonts w:hint="eastAsia"/>
+        </w:rPr>
+      </w:pPr>
+      <w:r>
+        <w:separator/>
+      </w:r>
+    </w:p>
+  </w:endnote>
+  <w:endnote w:type="continuationSeparator" w:id="0">
+    <w:p>
+      <w:pPr>
+        <w:spacing w:after="0" w:line="240" w:lineRule="auto"/>
+        <w:rPr>
+          <w:rFonts w:hint="eastAsia"/>
+        </w:rPr>
+      </w:pPr>
+      <w:r>
+        <w:continuationSeparator/>
+      </w:r>
+    </w:p>
+  </w:endnote>
+</w:endnotes>
+</file>
+
+<file path=word/footnotes.xml><?xml version="1.0" encoding="utf-8"?>
+<w:footnotes xmlns:wpc="http://schemas.microsoft.com/office/word/2010/wordprocessingCanvas" xmlns:cx="http://schemas.microsoft.com/office/drawing/2014/chartex" xmlns:cx1="http://schemas.microsoft.com/office/drawing/2015/9/8/chartex" xmlns:cx2="http://schemas.microsoft.com/office/drawing/2015/10/21/chartex" xmlns:cx3="http://schemas.microsoft.com/office/drawing/2016/5/9/chartex" xmlns:cx4="http://schemas.microsoft.com/office/drawing/2016/5/10/chartex" xmlns:cx5="http://schemas.microsoft.com/office/drawing/2016/5/11/chartex" xmlns:cx6="http://schemas.microsoft.com/office/drawing/2016/5/12/chartex" xmlns:cx7="http://schemas.microsoft.com/office/drawing/2016/5/13/chartex" xmlns:cx8="http://schemas.microsoft.com/office/drawing/2016/5/14/chartex" xmlns:mc="http://schemas.openxmlformats.org/markup-compatibility/2006" xmlns:aink="http://schemas.microsoft.com/office/drawing/2016/ink" xmlns:am3d="http://schemas.microsoft.com/office/drawing/2017/model3d" xmlns:o="urn:schemas-microsoft-com:office:office" xmlns:oel="http://schemas.microsoft.com/office/2019/extlst" xmlns:r="http://schemas.openxmlformats.org/officeDocument/2006/relationships" xmlns:m="http://schemas.openxmlformats.org/officeDocument/2006/math" xmlns:v="urn:schemas-microsoft-com:vml" xmlns:wp14="http://schemas.microsoft.com/office/word/2010/wordprocessingDrawing" xmlns:wp="http://schemas.openxmlformats.org/drawingml/2006/wordprocessingDrawing" xmlns:w10="urn:schemas-microsoft-com:office:word" xmlns:w="http://schemas.openxmlformats.org/wordprocessingml/2006/main" xmlns:w14="http://schemas.microsoft.com/office/word/2010/wordml" xmlns:w15="http://schemas.microsoft.com/office/word/2012/wordml" xmlns:w16cex="http://schemas.microsoft.com/office/word/2018/wordml/cex" xmlns:w16cid="http://schemas.microsoft.com/office/word/2016/wordml/cid" xmlns:w16="http://schemas.microsoft.com/office/word/2018/wordml" xmlns:w16sdtdh="http://schemas.microsoft.com/office/word/2020/wordml/sdtdatahash" xmlns:w16se="http://schemas.microsoft.com/office/word/2015/wordml/symex" xmlns:wpg="http://schemas.microsoft.com/office/word/2010/wordprocessingGroup" xmlns:wpi="http://schemas.microsoft.com/office/word/2010/wordprocessingInk" xmlns:wne="http://schemas.microsoft.com/office/word/2006/wordml" xmlns:wps="http://schemas.microsoft.com/office/word/2010/wordprocessingShape" mc:Ignorable="w14 w15 w16se w16cid w16 w16cex w16sdtdh wp14">
+  <w:footnote w:type="separator" w:id="-1">
+    <w:p>
+      <w:pPr>
+        <w:spacing w:after="0" w:line="240" w:lineRule="auto"/>
+        <w:rPr>
+          <w:rFonts w:hint="eastAsia"/>
+        </w:rPr>
+      </w:pPr>
+      <w:r>
+        <w:separator/>
+      </w:r>
+    </w:p>
+  </w:footnote>
+  <w:footnote w:type="continuationSeparator" w:id="0">
+    <w:p>
+      <w:pPr>
+        <w:spacing w:after="0" w:line="240" w:lineRule="auto"/>
+        <w:rPr>
+          <w:rFonts w:hint="eastAsia"/>
+        </w:rPr>
+      </w:pPr>
+      <w:r>
+        <w:continuationSeparator/>
+      </w:r>
+    </w:p>
+  </w:footnote>
+</w:footnotes>
 </file>
 
 <file path=word/styles.xml><?xml version="1.0" encoding="utf-8"?>
@@ -6237,7 +6523,7 @@
   <w:style w:type="paragraph" w:default="1" w:styleId="a">
     <w:name w:val="Normal"/>
     <w:qFormat/>
-    <w:rsid w:val="00E94C98"/>
+    <w:rsid w:val="0050361F"/>
     <w:pPr>
       <w:widowControl w:val="0"/>
     </w:pPr>
@@ -6897,6 +7183,69 @@
       <w:u w:val="single"/>
     </w:rPr>
   </w:style>
+  <w:style w:type="paragraph" w:styleId="af2">
+    <w:name w:val="header"/>
+    <w:basedOn w:val="a"/>
+    <w:link w:val="af3"/>
+    <w:uiPriority w:val="99"/>
+    <w:unhideWhenUsed/>
+    <w:rsid w:val="006B366B"/>
+    <w:pPr>
+      <w:tabs>
+        <w:tab w:val="center" w:pos="4153"/>
+        <w:tab w:val="right" w:pos="8306"/>
+      </w:tabs>
+      <w:snapToGrid w:val="0"/>
+      <w:spacing w:line="240" w:lineRule="auto"/>
+      <w:jc w:val="center"/>
+    </w:pPr>
+    <w:rPr>
+      <w:sz w:val="18"/>
+      <w:szCs w:val="18"/>
+    </w:rPr>
+  </w:style>
+  <w:style w:type="character" w:customStyle="1" w:styleId="af3">
+    <w:name w:val="页眉 字符"/>
+    <w:basedOn w:val="a0"/>
+    <w:link w:val="af2"/>
+    <w:uiPriority w:val="99"/>
+    <w:rsid w:val="006B366B"/>
+    <w:rPr>
+      <w:sz w:val="18"/>
+      <w:szCs w:val="18"/>
+    </w:rPr>
+  </w:style>
+  <w:style w:type="paragraph" w:styleId="af4">
+    <w:name w:val="footer"/>
+    <w:basedOn w:val="a"/>
+    <w:link w:val="af5"/>
+    <w:uiPriority w:val="99"/>
+    <w:unhideWhenUsed/>
+    <w:rsid w:val="006B366B"/>
+    <w:pPr>
+      <w:tabs>
+        <w:tab w:val="center" w:pos="4153"/>
+        <w:tab w:val="right" w:pos="8306"/>
+      </w:tabs>
+      <w:snapToGrid w:val="0"/>
+      <w:spacing w:line="240" w:lineRule="auto"/>
+    </w:pPr>
+    <w:rPr>
+      <w:sz w:val="18"/>
+      <w:szCs w:val="18"/>
+    </w:rPr>
+  </w:style>
+  <w:style w:type="character" w:customStyle="1" w:styleId="af5">
+    <w:name w:val="页脚 字符"/>
+    <w:basedOn w:val="a0"/>
+    <w:link w:val="af4"/>
+    <w:uiPriority w:val="99"/>
+    <w:rsid w:val="006B366B"/>
+    <w:rPr>
+      <w:sz w:val="18"/>
+      <w:szCs w:val="18"/>
+    </w:rPr>
+  </w:style>
 </w:styles>
 </file>
 

</xml_diff>

<commit_message>
fix: preserve release plan template text style
</commit_message>
<xml_diff>
--- a/server/templates/release-documents/投产变更方案模版.docx
+++ b/server/templates/release-documents/投产变更方案模版.docx
@@ -2566,7 +2566,7 @@
       <w:pPr>
         <w:spacing w:after="0" w:line="240" w:lineRule="auto"/>
         <w:rPr>
-          <w:rFonts w:ascii="微软雅黑" w:eastAsia="微软雅黑" w:hAnsi="微软雅黑"/>
+          <w:rFonts w:ascii="微软雅黑" w:eastAsia="微软雅黑" w:hAnsi="微软雅黑" w:hint="eastAsia"/>
           <w:sz w:val="18"/>
           <w:szCs w:val="18"/>
         </w:rPr>
@@ -3463,6 +3463,7 @@
         <w:spacing w:after="0" w:line="240" w:lineRule="auto"/>
         <w:rPr>
           <w:rFonts w:ascii="微软雅黑" w:eastAsia="微软雅黑" w:hAnsi="微软雅黑" w:hint="eastAsia"/>
+          <w:color w:val="4C94D8" w:themeColor="text2" w:themeTint="80"/>
           <w:sz w:val="18"/>
           <w:szCs w:val="18"/>
         </w:rPr>
@@ -3470,6 +3471,7 @@
       <w:r>
         <w:rPr>
           <w:rFonts w:ascii="微软雅黑" w:eastAsia="微软雅黑" w:hAnsi="微软雅黑" w:hint="eastAsia"/>
+          <w:color w:val="4C94D8" w:themeColor="text2" w:themeTint="80"/>
           <w:sz w:val="18"/>
           <w:szCs w:val="18"/>
         </w:rPr>
@@ -3889,7 +3891,7 @@
       <w:pPr>
         <w:spacing w:after="0" w:line="240" w:lineRule="auto"/>
         <w:rPr>
-          <w:rFonts w:ascii="微软雅黑" w:eastAsia="微软雅黑" w:hAnsi="微软雅黑"/>
+          <w:rFonts w:ascii="微软雅黑" w:eastAsia="微软雅黑" w:hAnsi="微软雅黑" w:hint="eastAsia"/>
           <w:color w:val="4C94D8" w:themeColor="text2" w:themeTint="80"/>
           <w:sz w:val="18"/>
           <w:szCs w:val="18"/>
@@ -4505,7 +4507,7 @@
       <w:pPr>
         <w:spacing w:after="0" w:line="240" w:lineRule="auto"/>
         <w:rPr>
-          <w:rFonts w:ascii="微软雅黑" w:eastAsia="微软雅黑" w:hAnsi="微软雅黑"/>
+          <w:rFonts w:ascii="微软雅黑" w:eastAsia="微软雅黑" w:hAnsi="微软雅黑" w:hint="eastAsia"/>
           <w:color w:val="4C94D8" w:themeColor="text2" w:themeTint="80"/>
           <w:sz w:val="18"/>
           <w:szCs w:val="18"/>
@@ -5397,7 +5399,7 @@
       <w:pPr>
         <w:spacing w:after="0" w:line="240" w:lineRule="auto"/>
         <w:rPr>
-          <w:rFonts w:ascii="微软雅黑" w:eastAsia="微软雅黑" w:hAnsi="微软雅黑"/>
+          <w:rFonts w:ascii="微软雅黑" w:eastAsia="微软雅黑" w:hAnsi="微软雅黑" w:hint="eastAsia"/>
           <w:color w:val="4C94D8" w:themeColor="text2" w:themeTint="80"/>
           <w:sz w:val="18"/>
           <w:szCs w:val="18"/>
@@ -5417,7 +5419,7 @@
       <w:pPr>
         <w:spacing w:after="0" w:line="240" w:lineRule="auto"/>
         <w:rPr>
-          <w:rFonts w:ascii="微软雅黑" w:eastAsia="微软雅黑" w:hAnsi="微软雅黑"/>
+          <w:rFonts w:ascii="微软雅黑" w:eastAsia="微软雅黑" w:hAnsi="微软雅黑" w:hint="eastAsia"/>
           <w:color w:val="4C94D8" w:themeColor="text2" w:themeTint="80"/>
           <w:sz w:val="18"/>
           <w:szCs w:val="18"/>
@@ -5437,7 +5439,7 @@
       <w:pPr>
         <w:spacing w:after="0" w:line="240" w:lineRule="auto"/>
         <w:rPr>
-          <w:rFonts w:ascii="微软雅黑" w:eastAsia="微软雅黑" w:hAnsi="微软雅黑"/>
+          <w:rFonts w:ascii="微软雅黑" w:eastAsia="微软雅黑" w:hAnsi="微软雅黑" w:hint="eastAsia"/>
           <w:color w:val="4C94D8" w:themeColor="text2" w:themeTint="80"/>
           <w:sz w:val="18"/>
           <w:szCs w:val="18"/>
@@ -5962,6 +5964,7 @@
         <w:spacing w:after="0" w:line="240" w:lineRule="auto"/>
         <w:rPr>
           <w:rFonts w:ascii="微软雅黑" w:eastAsia="微软雅黑" w:hAnsi="微软雅黑" w:hint="eastAsia"/>
+          <w:color w:val="4C94D8" w:themeColor="text2" w:themeTint="80"/>
           <w:sz w:val="18"/>
           <w:szCs w:val="18"/>
         </w:rPr>
@@ -5969,6 +5972,7 @@
       <w:r>
         <w:rPr>
           <w:rFonts w:ascii="微软雅黑" w:eastAsia="微软雅黑" w:hAnsi="微软雅黑" w:hint="eastAsia"/>
+          <w:color w:val="4C94D8" w:themeColor="text2" w:themeTint="80"/>
           <w:sz w:val="18"/>
           <w:szCs w:val="18"/>
         </w:rPr>
@@ -5995,7 +5999,7 @@
       <w:pPr>
         <w:spacing w:after="0" w:line="240" w:lineRule="auto"/>
         <w:rPr>
-          <w:rFonts w:ascii="微软雅黑" w:eastAsia="微软雅黑" w:hAnsi="微软雅黑"/>
+          <w:rFonts w:ascii="微软雅黑" w:eastAsia="微软雅黑" w:hAnsi="微软雅黑" w:hint="eastAsia"/>
           <w:color w:val="4C94D8" w:themeColor="text2" w:themeTint="80"/>
           <w:sz w:val="18"/>
           <w:szCs w:val="18"/>
@@ -6015,7 +6019,7 @@
       <w:pPr>
         <w:spacing w:after="0" w:line="240" w:lineRule="auto"/>
         <w:rPr>
-          <w:rFonts w:ascii="微软雅黑" w:eastAsia="微软雅黑" w:hAnsi="微软雅黑"/>
+          <w:rFonts w:ascii="微软雅黑" w:eastAsia="微软雅黑" w:hAnsi="微软雅黑" w:hint="eastAsia"/>
           <w:color w:val="4C94D8" w:themeColor="text2" w:themeTint="80"/>
           <w:sz w:val="18"/>
           <w:szCs w:val="18"/>

</xml_diff>